<commit_message>
taken code directly from code
</commit_message>
<xml_diff>
--- a/outputs/lab_record_recreated.docx
+++ b/outputs/lab_record_recreated.docx
@@ -195,6 +195,32 @@
           <w:sz w:val="24"/>
           <w:szCs w:val="24"/>
         </w:rPr>
+        <w:t xml:space="preserve"/>
+      </w:r>
+    </w:p>
+    <w:p>
+      <w:pPr>
+        <w:spacing w:line="276" w:lineRule="auto"/>
+      </w:pPr>
+      <w:r>
+        <w:rPr>
+          <w:rFonts w:ascii="Times New Roman" w:cs="Times New Roman" w:eastAsia="Times New Roman" w:hAnsi="Times New Roman"/>
+          <w:sz w:val="24"/>
+          <w:szCs w:val="24"/>
+        </w:rPr>
+        <w:t xml:space="preserve"/>
+      </w:r>
+    </w:p>
+    <w:p>
+      <w:pPr>
+        <w:spacing w:line="276" w:lineRule="auto"/>
+      </w:pPr>
+      <w:r>
+        <w:rPr>
+          <w:rFonts w:ascii="Times New Roman" w:cs="Times New Roman" w:eastAsia="Times New Roman" w:hAnsi="Times New Roman"/>
+          <w:sz w:val="24"/>
+          <w:szCs w:val="24"/>
+        </w:rPr>
         <w:t xml:space="preserve">def assignment_bruteforce(cost_matrix):</w:t>
       </w:r>
     </w:p>
@@ -247,165 +273,241 @@
           <w:sz w:val="24"/>
           <w:szCs w:val="24"/>
         </w:rPr>
-        <w:t xml:space="preserve">min_cost = float('inf')</w:t>
-      </w:r>
-    </w:p>
-    <w:p>
-      <w:pPr>
-        <w:spacing w:line="276" w:lineRule="auto"/>
-      </w:pPr>
-      <w:r>
-        <w:rPr>
-          <w:rFonts w:ascii="Times New Roman" w:cs="Times New Roman" w:eastAsia="Times New Roman" w:hAnsi="Times New Roman"/>
-          <w:sz w:val="24"/>
-          <w:szCs w:val="24"/>
-        </w:rPr>
-        <w:t xml:space="preserve"/>
-      </w:r>
-    </w:p>
-    <w:p>
-      <w:pPr>
-        <w:spacing w:line="276" w:lineRule="auto"/>
-      </w:pPr>
-      <w:r>
-        <w:rPr>
-          <w:rFonts w:ascii="Times New Roman" w:cs="Times New Roman" w:eastAsia="Times New Roman" w:hAnsi="Times New Roman"/>
-          <w:sz w:val="24"/>
-          <w:szCs w:val="24"/>
-        </w:rPr>
-        <w:t xml:space="preserve">best_assignment = None</w:t>
-      </w:r>
-    </w:p>
-    <w:p>
-      <w:pPr>
-        <w:spacing w:line="276" w:lineRule="auto"/>
-      </w:pPr>
-      <w:r>
-        <w:rPr>
-          <w:rFonts w:ascii="Times New Roman" w:cs="Times New Roman" w:eastAsia="Times New Roman" w:hAnsi="Times New Roman"/>
-          <w:sz w:val="24"/>
-          <w:szCs w:val="24"/>
-        </w:rPr>
-        <w:t xml:space="preserve"/>
-      </w:r>
-    </w:p>
-    <w:p>
-      <w:pPr>
-        <w:spacing w:line="276" w:lineRule="auto"/>
-      </w:pPr>
-      <w:r>
-        <w:rPr>
-          <w:rFonts w:ascii="Times New Roman" w:cs="Times New Roman" w:eastAsia="Times New Roman" w:hAnsi="Times New Roman"/>
-          <w:sz w:val="24"/>
-          <w:szCs w:val="24"/>
-        </w:rPr>
-        <w:t xml:space="preserve">    	for perm in itertools.permutations(range(n)):</w:t>
-      </w:r>
-    </w:p>
-    <w:p>
-      <w:pPr>
-        <w:spacing w:line="276" w:lineRule="auto"/>
-      </w:pPr>
-      <w:r>
-        <w:rPr>
-          <w:rFonts w:ascii="Times New Roman" w:cs="Times New Roman" w:eastAsia="Times New Roman" w:hAnsi="Times New Roman"/>
-          <w:sz w:val="24"/>
-          <w:szCs w:val="24"/>
-        </w:rPr>
-        <w:t xml:space="preserve"/>
-      </w:r>
-    </w:p>
-    <w:p>
-      <w:pPr>
-        <w:spacing w:line="276" w:lineRule="auto"/>
-      </w:pPr>
-      <w:r>
-        <w:rPr>
-          <w:rFonts w:ascii="Times New Roman" w:cs="Times New Roman" w:eastAsia="Times New Roman" w:hAnsi="Times New Roman"/>
-          <w:sz w:val="24"/>
-          <w:szCs w:val="24"/>
-        </w:rPr>
-        <w:t xml:space="preserve">        	cost = sum(cost_matrix[i][perm[i]] for i in range(n))</w:t>
-      </w:r>
-    </w:p>
-    <w:p>
-      <w:pPr>
-        <w:spacing w:line="276" w:lineRule="auto"/>
-      </w:pPr>
-      <w:r>
-        <w:rPr>
-          <w:rFonts w:ascii="Times New Roman" w:cs="Times New Roman" w:eastAsia="Times New Roman" w:hAnsi="Times New Roman"/>
-          <w:sz w:val="24"/>
-          <w:szCs w:val="24"/>
-        </w:rPr>
-        <w:t xml:space="preserve"/>
-      </w:r>
-    </w:p>
-    <w:p>
-      <w:pPr>
-        <w:spacing w:line="276" w:lineRule="auto"/>
-      </w:pPr>
-      <w:r>
-        <w:rPr>
-          <w:rFonts w:ascii="Times New Roman" w:cs="Times New Roman" w:eastAsia="Times New Roman" w:hAnsi="Times New Roman"/>
-          <w:sz w:val="24"/>
-          <w:szCs w:val="24"/>
-        </w:rPr>
-        <w:t xml:space="preserve">        		if cost &lt;min_cost:</w:t>
-      </w:r>
-    </w:p>
-    <w:p>
-      <w:pPr>
-        <w:spacing w:line="276" w:lineRule="auto"/>
-      </w:pPr>
-      <w:r>
-        <w:rPr>
-          <w:rFonts w:ascii="Times New Roman" w:cs="Times New Roman" w:eastAsia="Times New Roman" w:hAnsi="Times New Roman"/>
-          <w:sz w:val="24"/>
-          <w:szCs w:val="24"/>
-        </w:rPr>
-        <w:t xml:space="preserve"/>
-      </w:r>
-    </w:p>
-    <w:p>
-      <w:pPr>
-        <w:spacing w:line="276" w:lineRule="auto"/>
-        <w:ind w:left="720" w:firstLine="720"/>
-      </w:pPr>
-      <w:r>
-        <w:rPr>
-          <w:rFonts w:ascii="Times New Roman" w:cs="Times New Roman" w:eastAsia="Times New Roman" w:hAnsi="Times New Roman"/>
-          <w:sz w:val="24"/>
-          <w:szCs w:val="24"/>
-        </w:rPr>
-        <w:t xml:space="preserve">min_cost = cost</w:t>
-      </w:r>
-    </w:p>
-    <w:p>
-      <w:pPr>
-        <w:spacing w:line="276" w:lineRule="auto"/>
-      </w:pPr>
-      <w:r>
-        <w:rPr>
-          <w:rFonts w:ascii="Times New Roman" w:cs="Times New Roman" w:eastAsia="Times New Roman" w:hAnsi="Times New Roman"/>
-          <w:sz w:val="24"/>
-          <w:szCs w:val="24"/>
-        </w:rPr>
-        <w:t xml:space="preserve"/>
-      </w:r>
-    </w:p>
-    <w:p>
-      <w:pPr>
-        <w:spacing w:line="276" w:lineRule="auto"/>
-        <w:ind w:left="720" w:firstLine="720"/>
-      </w:pPr>
-      <w:r>
-        <w:rPr>
-          <w:rFonts w:ascii="Times New Roman" w:cs="Times New Roman" w:eastAsia="Times New Roman" w:hAnsi="Times New Roman"/>
-          <w:sz w:val="24"/>
-          <w:szCs w:val="24"/>
-        </w:rPr>
-        <w:t xml:space="preserve">best_assignment = perm</w:t>
+        <w:t xml:space="preserve">    min_cost = float('inf')</w:t>
+      </w:r>
+    </w:p>
+    <w:p>
+      <w:pPr>
+        <w:spacing w:line="276" w:lineRule="auto"/>
+      </w:pPr>
+      <w:r>
+        <w:rPr>
+          <w:rFonts w:ascii="Times New Roman" w:cs="Times New Roman" w:eastAsia="Times New Roman" w:hAnsi="Times New Roman"/>
+          <w:sz w:val="24"/>
+          <w:szCs w:val="24"/>
+        </w:rPr>
+        <w:t xml:space="preserve"/>
+      </w:r>
+    </w:p>
+    <w:p>
+      <w:pPr>
+        <w:spacing w:line="276" w:lineRule="auto"/>
+      </w:pPr>
+      <w:r>
+        <w:rPr>
+          <w:rFonts w:ascii="Times New Roman" w:cs="Times New Roman" w:eastAsia="Times New Roman" w:hAnsi="Times New Roman"/>
+          <w:sz w:val="24"/>
+          <w:szCs w:val="24"/>
+        </w:rPr>
+        <w:t xml:space="preserve">    best_assignment = None</w:t>
+      </w:r>
+    </w:p>
+    <w:p>
+      <w:pPr>
+        <w:spacing w:line="276" w:lineRule="auto"/>
+      </w:pPr>
+      <w:r>
+        <w:rPr>
+          <w:rFonts w:ascii="Times New Roman" w:cs="Times New Roman" w:eastAsia="Times New Roman" w:hAnsi="Times New Roman"/>
+          <w:sz w:val="24"/>
+          <w:szCs w:val="24"/>
+        </w:rPr>
+        <w:t xml:space="preserve"/>
+      </w:r>
+    </w:p>
+    <w:p>
+      <w:pPr>
+        <w:spacing w:line="276" w:lineRule="auto"/>
+      </w:pPr>
+      <w:r>
+        <w:rPr>
+          <w:rFonts w:ascii="Times New Roman" w:cs="Times New Roman" w:eastAsia="Times New Roman" w:hAnsi="Times New Roman"/>
+          <w:sz w:val="24"/>
+          <w:szCs w:val="24"/>
+        </w:rPr>
+        <w:t xml:space="preserve"/>
+      </w:r>
+    </w:p>
+    <w:p>
+      <w:pPr>
+        <w:spacing w:line="276" w:lineRule="auto"/>
+      </w:pPr>
+      <w:r>
+        <w:rPr>
+          <w:rFonts w:ascii="Times New Roman" w:cs="Times New Roman" w:eastAsia="Times New Roman" w:hAnsi="Times New Roman"/>
+          <w:sz w:val="24"/>
+          <w:szCs w:val="24"/>
+        </w:rPr>
+        <w:t xml:space="preserve"/>
+      </w:r>
+    </w:p>
+    <w:p>
+      <w:pPr>
+        <w:spacing w:line="276" w:lineRule="auto"/>
+      </w:pPr>
+      <w:r>
+        <w:rPr>
+          <w:rFonts w:ascii="Times New Roman" w:cs="Times New Roman" w:eastAsia="Times New Roman" w:hAnsi="Times New Roman"/>
+          <w:sz w:val="24"/>
+          <w:szCs w:val="24"/>
+        </w:rPr>
+        <w:t xml:space="preserve">    for perm in itertools.permutations(range(n)):</w:t>
+      </w:r>
+    </w:p>
+    <w:p>
+      <w:pPr>
+        <w:spacing w:line="276" w:lineRule="auto"/>
+      </w:pPr>
+      <w:r>
+        <w:rPr>
+          <w:rFonts w:ascii="Times New Roman" w:cs="Times New Roman" w:eastAsia="Times New Roman" w:hAnsi="Times New Roman"/>
+          <w:sz w:val="24"/>
+          <w:szCs w:val="24"/>
+        </w:rPr>
+        <w:t xml:space="preserve"/>
+      </w:r>
+    </w:p>
+    <w:p>
+      <w:pPr>
+        <w:spacing w:line="276" w:lineRule="auto"/>
+      </w:pPr>
+      <w:r>
+        <w:rPr>
+          <w:rFonts w:ascii="Times New Roman" w:cs="Times New Roman" w:eastAsia="Times New Roman" w:hAnsi="Times New Roman"/>
+          <w:sz w:val="24"/>
+          <w:szCs w:val="24"/>
+        </w:rPr>
+        <w:t xml:space="preserve">        cost = sum(cost_matrix[i][perm[i]] for i in range(n))</w:t>
+      </w:r>
+    </w:p>
+    <w:p>
+      <w:pPr>
+        <w:spacing w:line="276" w:lineRule="auto"/>
+      </w:pPr>
+      <w:r>
+        <w:rPr>
+          <w:rFonts w:ascii="Times New Roman" w:cs="Times New Roman" w:eastAsia="Times New Roman" w:hAnsi="Times New Roman"/>
+          <w:sz w:val="24"/>
+          <w:szCs w:val="24"/>
+        </w:rPr>
+        <w:t xml:space="preserve"/>
+      </w:r>
+    </w:p>
+    <w:p>
+      <w:pPr>
+        <w:spacing w:line="276" w:lineRule="auto"/>
+      </w:pPr>
+      <w:r>
+        <w:rPr>
+          <w:rFonts w:ascii="Times New Roman" w:cs="Times New Roman" w:eastAsia="Times New Roman" w:hAnsi="Times New Roman"/>
+          <w:sz w:val="24"/>
+          <w:szCs w:val="24"/>
+        </w:rPr>
+        <w:t xml:space="preserve"/>
+      </w:r>
+    </w:p>
+    <w:p>
+      <w:pPr>
+        <w:spacing w:line="276" w:lineRule="auto"/>
+      </w:pPr>
+      <w:r>
+        <w:rPr>
+          <w:rFonts w:ascii="Times New Roman" w:cs="Times New Roman" w:eastAsia="Times New Roman" w:hAnsi="Times New Roman"/>
+          <w:sz w:val="24"/>
+          <w:szCs w:val="24"/>
+        </w:rPr>
+        <w:t xml:space="preserve"/>
+      </w:r>
+    </w:p>
+    <w:p>
+      <w:pPr>
+        <w:spacing w:line="276" w:lineRule="auto"/>
+      </w:pPr>
+      <w:r>
+        <w:rPr>
+          <w:rFonts w:ascii="Times New Roman" w:cs="Times New Roman" w:eastAsia="Times New Roman" w:hAnsi="Times New Roman"/>
+          <w:sz w:val="24"/>
+          <w:szCs w:val="24"/>
+        </w:rPr>
+        <w:t xml:space="preserve">        if cost &lt; min_cost:</w:t>
+      </w:r>
+    </w:p>
+    <w:p>
+      <w:pPr>
+        <w:spacing w:line="276" w:lineRule="auto"/>
+      </w:pPr>
+      <w:r>
+        <w:rPr>
+          <w:rFonts w:ascii="Times New Roman" w:cs="Times New Roman" w:eastAsia="Times New Roman" w:hAnsi="Times New Roman"/>
+          <w:sz w:val="24"/>
+          <w:szCs w:val="24"/>
+        </w:rPr>
+        <w:t xml:space="preserve"/>
+      </w:r>
+    </w:p>
+    <w:p>
+      <w:pPr>
+        <w:spacing w:line="276" w:lineRule="auto"/>
+      </w:pPr>
+      <w:r>
+        <w:rPr>
+          <w:rFonts w:ascii="Times New Roman" w:cs="Times New Roman" w:eastAsia="Times New Roman" w:hAnsi="Times New Roman"/>
+          <w:sz w:val="24"/>
+          <w:szCs w:val="24"/>
+        </w:rPr>
+        <w:t xml:space="preserve">            min_cost = cost</w:t>
+      </w:r>
+    </w:p>
+    <w:p>
+      <w:pPr>
+        <w:spacing w:line="276" w:lineRule="auto"/>
+      </w:pPr>
+      <w:r>
+        <w:rPr>
+          <w:rFonts w:ascii="Times New Roman" w:cs="Times New Roman" w:eastAsia="Times New Roman" w:hAnsi="Times New Roman"/>
+          <w:sz w:val="24"/>
+          <w:szCs w:val="24"/>
+        </w:rPr>
+        <w:t xml:space="preserve"/>
+      </w:r>
+    </w:p>
+    <w:p>
+      <w:pPr>
+        <w:spacing w:line="276" w:lineRule="auto"/>
+      </w:pPr>
+      <w:r>
+        <w:rPr>
+          <w:rFonts w:ascii="Times New Roman" w:cs="Times New Roman" w:eastAsia="Times New Roman" w:hAnsi="Times New Roman"/>
+          <w:sz w:val="24"/>
+          <w:szCs w:val="24"/>
+        </w:rPr>
+        <w:t xml:space="preserve">            best_assignment = perm</w:t>
+      </w:r>
+    </w:p>
+    <w:p>
+      <w:pPr>
+        <w:spacing w:line="276" w:lineRule="auto"/>
+      </w:pPr>
+      <w:r>
+        <w:rPr>
+          <w:rFonts w:ascii="Times New Roman" w:cs="Times New Roman" w:eastAsia="Times New Roman" w:hAnsi="Times New Roman"/>
+          <w:sz w:val="24"/>
+          <w:szCs w:val="24"/>
+        </w:rPr>
+        <w:t xml:space="preserve"/>
+      </w:r>
+    </w:p>
+    <w:p>
+      <w:pPr>
+        <w:spacing w:line="276" w:lineRule="auto"/>
+      </w:pPr>
+      <w:r>
+        <w:rPr>
+          <w:rFonts w:ascii="Times New Roman" w:cs="Times New Roman" w:eastAsia="Times New Roman" w:hAnsi="Times New Roman"/>
+          <w:sz w:val="24"/>
+          <w:szCs w:val="24"/>
+        </w:rPr>
+        <w:t xml:space="preserve"/>
       </w:r>
     </w:p>
     <w:p>
@@ -457,6 +559,84 @@
           <w:sz w:val="24"/>
           <w:szCs w:val="24"/>
         </w:rPr>
+        <w:t xml:space="preserve"/>
+      </w:r>
+    </w:p>
+    <w:p>
+      <w:pPr>
+        <w:spacing w:line="276" w:lineRule="auto"/>
+      </w:pPr>
+      <w:r>
+        <w:rPr>
+          <w:rFonts w:ascii="Times New Roman" w:cs="Times New Roman" w:eastAsia="Times New Roman" w:hAnsi="Times New Roman"/>
+          <w:sz w:val="24"/>
+          <w:szCs w:val="24"/>
+        </w:rPr>
+        <w:t xml:space="preserve"/>
+      </w:r>
+    </w:p>
+    <w:p>
+      <w:pPr>
+        <w:spacing w:line="276" w:lineRule="auto"/>
+      </w:pPr>
+      <w:r>
+        <w:rPr>
+          <w:rFonts w:ascii="Times New Roman" w:cs="Times New Roman" w:eastAsia="Times New Roman" w:hAnsi="Times New Roman"/>
+          <w:sz w:val="24"/>
+          <w:szCs w:val="24"/>
+        </w:rPr>
+        <w:t xml:space="preserve"/>
+      </w:r>
+    </w:p>
+    <w:p>
+      <w:pPr>
+        <w:spacing w:line="276" w:lineRule="auto"/>
+      </w:pPr>
+      <w:r>
+        <w:rPr>
+          <w:rFonts w:ascii="Times New Roman" w:cs="Times New Roman" w:eastAsia="Times New Roman" w:hAnsi="Times New Roman"/>
+          <w:sz w:val="24"/>
+          <w:szCs w:val="24"/>
+        </w:rPr>
+        <w:t xml:space="preserve"/>
+      </w:r>
+    </w:p>
+    <w:p>
+      <w:pPr>
+        <w:spacing w:line="276" w:lineRule="auto"/>
+      </w:pPr>
+      <w:r>
+        <w:rPr>
+          <w:rFonts w:ascii="Times New Roman" w:cs="Times New Roman" w:eastAsia="Times New Roman" w:hAnsi="Times New Roman"/>
+          <w:sz w:val="24"/>
+          <w:szCs w:val="24"/>
+        </w:rPr>
+        <w:t xml:space="preserve"># Cost matrix</w:t>
+      </w:r>
+    </w:p>
+    <w:p>
+      <w:pPr>
+        <w:spacing w:line="276" w:lineRule="auto"/>
+      </w:pPr>
+      <w:r>
+        <w:rPr>
+          <w:rFonts w:ascii="Times New Roman" w:cs="Times New Roman" w:eastAsia="Times New Roman" w:hAnsi="Times New Roman"/>
+          <w:sz w:val="24"/>
+          <w:szCs w:val="24"/>
+        </w:rPr>
+        <w:t xml:space="preserve"/>
+      </w:r>
+    </w:p>
+    <w:p>
+      <w:pPr>
+        <w:spacing w:line="276" w:lineRule="auto"/>
+      </w:pPr>
+      <w:r>
+        <w:rPr>
+          <w:rFonts w:ascii="Times New Roman" w:cs="Times New Roman" w:eastAsia="Times New Roman" w:hAnsi="Times New Roman"/>
+          <w:sz w:val="24"/>
+          <w:szCs w:val="24"/>
+        </w:rPr>
         <w:t xml:space="preserve">cost_matrix = [</w:t>
       </w:r>
     </w:p>
@@ -613,7 +793,85 @@
           <w:sz w:val="24"/>
           <w:szCs w:val="24"/>
         </w:rPr>
+        <w:t xml:space="preserve"/>
+      </w:r>
+    </w:p>
+    <w:p>
+      <w:pPr>
+        <w:spacing w:line="276" w:lineRule="auto"/>
+      </w:pPr>
+      <w:r>
+        <w:rPr>
+          <w:rFonts w:ascii="Times New Roman" w:cs="Times New Roman" w:eastAsia="Times New Roman" w:hAnsi="Times New Roman"/>
+          <w:sz w:val="24"/>
+          <w:szCs w:val="24"/>
+        </w:rPr>
+        <w:t xml:space="preserve"/>
+      </w:r>
+    </w:p>
+    <w:p>
+      <w:pPr>
+        <w:spacing w:line="276" w:lineRule="auto"/>
+      </w:pPr>
+      <w:r>
+        <w:rPr>
+          <w:rFonts w:ascii="Times New Roman" w:cs="Times New Roman" w:eastAsia="Times New Roman" w:hAnsi="Times New Roman"/>
+          <w:sz w:val="24"/>
+          <w:szCs w:val="24"/>
+        </w:rPr>
+        <w:t xml:space="preserve"># Find the optimal assignment</w:t>
+      </w:r>
+    </w:p>
+    <w:p>
+      <w:pPr>
+        <w:spacing w:line="276" w:lineRule="auto"/>
+      </w:pPr>
+      <w:r>
+        <w:rPr>
+          <w:rFonts w:ascii="Times New Roman" w:cs="Times New Roman" w:eastAsia="Times New Roman" w:hAnsi="Times New Roman"/>
+          <w:sz w:val="24"/>
+          <w:szCs w:val="24"/>
+        </w:rPr>
+        <w:t xml:space="preserve"/>
+      </w:r>
+    </w:p>
+    <w:p>
+      <w:pPr>
+        <w:spacing w:line="276" w:lineRule="auto"/>
+      </w:pPr>
+      <w:r>
+        <w:rPr>
+          <w:rFonts w:ascii="Times New Roman" w:cs="Times New Roman" w:eastAsia="Times New Roman" w:hAnsi="Times New Roman"/>
+          <w:sz w:val="24"/>
+          <w:szCs w:val="24"/>
+        </w:rPr>
         <w:t xml:space="preserve">assignment, cost = assignment_bruteforce(cost_matrix)</w:t>
+      </w:r>
+    </w:p>
+    <w:p>
+      <w:pPr>
+        <w:spacing w:line="276" w:lineRule="auto"/>
+      </w:pPr>
+      <w:r>
+        <w:rPr>
+          <w:rFonts w:ascii="Times New Roman" w:cs="Times New Roman" w:eastAsia="Times New Roman" w:hAnsi="Times New Roman"/>
+          <w:sz w:val="24"/>
+          <w:szCs w:val="24"/>
+        </w:rPr>
+        <w:t xml:space="preserve"/>
+      </w:r>
+    </w:p>
+    <w:p>
+      <w:pPr>
+        <w:spacing w:line="276" w:lineRule="auto"/>
+      </w:pPr>
+      <w:r>
+        <w:rPr>
+          <w:rFonts w:ascii="Times New Roman" w:cs="Times New Roman" w:eastAsia="Times New Roman" w:hAnsi="Times New Roman"/>
+          <w:sz w:val="24"/>
+          <w:szCs w:val="24"/>
+        </w:rPr>
+        <w:t xml:space="preserve"/>
       </w:r>
     </w:p>
     <w:p>

</xml_diff>

<commit_message>
final: exatly recreated the fixed version fof the docuemtn template
</commit_message>
<xml_diff>
--- a/outputs/lab_record_recreated.docx
+++ b/outputs/lab_record_recreated.docx
@@ -4,17 +4,8 @@
   <w:body>
     <w:p>
       <w:pPr>
-        <w:spacing w:line="276" w:lineRule="auto"/>
-        <w:ind w:left="360"/>
-      </w:pPr>
-      <w:r>
-        <w:rPr>
-          <w:rFonts w:ascii="Times New Roman" w:cs="Times New Roman" w:eastAsia="Times New Roman" w:hAnsi="Times New Roman"/>
-          <w:sz w:val="24"/>
-          <w:szCs w:val="24"/>
-        </w:rPr>
-        <w:t xml:space="preserve">					</w:t>
-      </w:r>
+        <w:jc w:val="center"/>
+      </w:pPr>
       <w:r>
         <w:rPr>
           <w:rFonts w:ascii="Times New Roman" w:cs="Times New Roman" w:eastAsia="Times New Roman" w:hAnsi="Times New Roman"/>
@@ -148,780 +139,390 @@
     </w:p>
     <w:p>
       <w:pPr>
-        <w:spacing w:line="276" w:lineRule="auto"/>
-      </w:pPr>
-      <w:r>
-        <w:rPr>
-          <w:rFonts w:ascii="Times New Roman" w:cs="Times New Roman" w:eastAsia="Times New Roman" w:hAnsi="Times New Roman"/>
-          <w:sz w:val="24"/>
-          <w:szCs w:val="24"/>
-        </w:rPr>
-        <w:t xml:space="preserve"/>
-      </w:r>
-    </w:p>
-    <w:p>
-      <w:pPr>
-        <w:spacing w:line="276" w:lineRule="auto"/>
-      </w:pPr>
-      <w:r>
-        <w:rPr>
-          <w:rFonts w:ascii="Times New Roman" w:cs="Times New Roman" w:eastAsia="Times New Roman" w:hAnsi="Times New Roman"/>
-          <w:sz w:val="24"/>
-          <w:szCs w:val="24"/>
+        <w:spacing w:after="0" w:before="0" w:line="240" w:lineRule="auto"/>
+      </w:pPr>
+      <w:r>
+        <w:rPr>
+          <w:rFonts w:ascii="Consolas" w:cs="Consolas" w:eastAsia="Consolas" w:hAnsi="Consolas"/>
+          <w:sz w:val="20"/>
+          <w:szCs w:val="20"/>
         </w:rPr>
         <w:t xml:space="preserve">import itertools</w:t>
       </w:r>
     </w:p>
     <w:p>
       <w:pPr>
-        <w:spacing w:line="276" w:lineRule="auto"/>
-      </w:pPr>
-      <w:r>
-        <w:rPr>
-          <w:rFonts w:ascii="Times New Roman" w:cs="Times New Roman" w:eastAsia="Times New Roman" w:hAnsi="Times New Roman"/>
-          <w:sz w:val="24"/>
-          <w:szCs w:val="24"/>
-        </w:rPr>
-        <w:t xml:space="preserve"/>
-      </w:r>
-    </w:p>
-    <w:p>
-      <w:pPr>
-        <w:spacing w:line="276" w:lineRule="auto"/>
-      </w:pPr>
-      <w:r>
-        <w:rPr>
-          <w:rFonts w:ascii="Times New Roman" w:cs="Times New Roman" w:eastAsia="Times New Roman" w:hAnsi="Times New Roman"/>
-          <w:sz w:val="24"/>
-          <w:szCs w:val="24"/>
-        </w:rPr>
-        <w:t xml:space="preserve"/>
-      </w:r>
-    </w:p>
-    <w:p>
-      <w:pPr>
-        <w:spacing w:line="276" w:lineRule="auto"/>
-      </w:pPr>
-      <w:r>
-        <w:rPr>
-          <w:rFonts w:ascii="Times New Roman" w:cs="Times New Roman" w:eastAsia="Times New Roman" w:hAnsi="Times New Roman"/>
-          <w:sz w:val="24"/>
-          <w:szCs w:val="24"/>
-        </w:rPr>
-        <w:t xml:space="preserve"/>
-      </w:r>
-    </w:p>
-    <w:p>
-      <w:pPr>
-        <w:spacing w:line="276" w:lineRule="auto"/>
-      </w:pPr>
-      <w:r>
-        <w:rPr>
-          <w:rFonts w:ascii="Times New Roman" w:cs="Times New Roman" w:eastAsia="Times New Roman" w:hAnsi="Times New Roman"/>
-          <w:sz w:val="24"/>
-          <w:szCs w:val="24"/>
+        <w:spacing w:after="0" w:before="0" w:line="240" w:lineRule="auto"/>
+      </w:pPr>
+      <w:r>
+        <w:rPr>
+          <w:rFonts w:ascii="Consolas" w:cs="Consolas" w:eastAsia="Consolas" w:hAnsi="Consolas"/>
+          <w:sz w:val="20"/>
+          <w:szCs w:val="20"/>
+        </w:rPr>
+        <w:t xml:space="preserve"/>
+      </w:r>
+    </w:p>
+    <w:p>
+      <w:pPr>
+        <w:spacing w:after="0" w:before="0" w:line="240" w:lineRule="auto"/>
+      </w:pPr>
+      <w:r>
+        <w:rPr>
+          <w:rFonts w:ascii="Consolas" w:cs="Consolas" w:eastAsia="Consolas" w:hAnsi="Consolas"/>
+          <w:sz w:val="20"/>
+          <w:szCs w:val="20"/>
         </w:rPr>
         <w:t xml:space="preserve">def assignment_bruteforce(cost_matrix):</w:t>
       </w:r>
     </w:p>
     <w:p>
       <w:pPr>
-        <w:spacing w:line="276" w:lineRule="auto"/>
-      </w:pPr>
-      <w:r>
-        <w:rPr>
-          <w:rFonts w:ascii="Times New Roman" w:cs="Times New Roman" w:eastAsia="Times New Roman" w:hAnsi="Times New Roman"/>
-          <w:sz w:val="24"/>
-          <w:szCs w:val="24"/>
-        </w:rPr>
-        <w:t xml:space="preserve"/>
-      </w:r>
-    </w:p>
-    <w:p>
-      <w:pPr>
-        <w:spacing w:line="276" w:lineRule="auto"/>
-      </w:pPr>
-      <w:r>
-        <w:rPr>
-          <w:rFonts w:ascii="Times New Roman" w:cs="Times New Roman" w:eastAsia="Times New Roman" w:hAnsi="Times New Roman"/>
-          <w:sz w:val="24"/>
-          <w:szCs w:val="24"/>
+        <w:spacing w:after="0" w:before="0" w:line="240" w:lineRule="auto"/>
+      </w:pPr>
+      <w:r>
+        <w:rPr>
+          <w:rFonts w:ascii="Consolas" w:cs="Consolas" w:eastAsia="Consolas" w:hAnsi="Consolas"/>
+          <w:sz w:val="20"/>
+          <w:szCs w:val="20"/>
         </w:rPr>
         <w:t xml:space="preserve">    n = len(cost_matrix)</w:t>
       </w:r>
     </w:p>
     <w:p>
       <w:pPr>
-        <w:spacing w:line="276" w:lineRule="auto"/>
-      </w:pPr>
-      <w:r>
-        <w:rPr>
-          <w:rFonts w:ascii="Times New Roman" w:cs="Times New Roman" w:eastAsia="Times New Roman" w:hAnsi="Times New Roman"/>
-          <w:sz w:val="24"/>
-          <w:szCs w:val="24"/>
-        </w:rPr>
-        <w:t xml:space="preserve"/>
-      </w:r>
-    </w:p>
-    <w:p>
-      <w:pPr>
-        <w:spacing w:line="276" w:lineRule="auto"/>
-      </w:pPr>
-      <w:r>
-        <w:rPr>
-          <w:rFonts w:ascii="Times New Roman" w:cs="Times New Roman" w:eastAsia="Times New Roman" w:hAnsi="Times New Roman"/>
-          <w:sz w:val="24"/>
-          <w:szCs w:val="24"/>
+        <w:spacing w:after="0" w:before="0" w:line="240" w:lineRule="auto"/>
+      </w:pPr>
+      <w:r>
+        <w:rPr>
+          <w:rFonts w:ascii="Consolas" w:cs="Consolas" w:eastAsia="Consolas" w:hAnsi="Consolas"/>
+          <w:sz w:val="20"/>
+          <w:szCs w:val="20"/>
         </w:rPr>
         <w:t xml:space="preserve">    min_cost = float('inf')</w:t>
       </w:r>
     </w:p>
     <w:p>
       <w:pPr>
-        <w:spacing w:line="276" w:lineRule="auto"/>
-      </w:pPr>
-      <w:r>
-        <w:rPr>
-          <w:rFonts w:ascii="Times New Roman" w:cs="Times New Roman" w:eastAsia="Times New Roman" w:hAnsi="Times New Roman"/>
-          <w:sz w:val="24"/>
-          <w:szCs w:val="24"/>
-        </w:rPr>
-        <w:t xml:space="preserve"/>
-      </w:r>
-    </w:p>
-    <w:p>
-      <w:pPr>
-        <w:spacing w:line="276" w:lineRule="auto"/>
-      </w:pPr>
-      <w:r>
-        <w:rPr>
-          <w:rFonts w:ascii="Times New Roman" w:cs="Times New Roman" w:eastAsia="Times New Roman" w:hAnsi="Times New Roman"/>
-          <w:sz w:val="24"/>
-          <w:szCs w:val="24"/>
+        <w:spacing w:after="0" w:before="0" w:line="240" w:lineRule="auto"/>
+      </w:pPr>
+      <w:r>
+        <w:rPr>
+          <w:rFonts w:ascii="Consolas" w:cs="Consolas" w:eastAsia="Consolas" w:hAnsi="Consolas"/>
+          <w:sz w:val="20"/>
+          <w:szCs w:val="20"/>
         </w:rPr>
         <w:t xml:space="preserve">    best_assignment = None</w:t>
       </w:r>
     </w:p>
     <w:p>
       <w:pPr>
-        <w:spacing w:line="276" w:lineRule="auto"/>
-      </w:pPr>
-      <w:r>
-        <w:rPr>
-          <w:rFonts w:ascii="Times New Roman" w:cs="Times New Roman" w:eastAsia="Times New Roman" w:hAnsi="Times New Roman"/>
-          <w:sz w:val="24"/>
-          <w:szCs w:val="24"/>
-        </w:rPr>
-        <w:t xml:space="preserve"/>
-      </w:r>
-    </w:p>
-    <w:p>
-      <w:pPr>
-        <w:spacing w:line="276" w:lineRule="auto"/>
-      </w:pPr>
-      <w:r>
-        <w:rPr>
-          <w:rFonts w:ascii="Times New Roman" w:cs="Times New Roman" w:eastAsia="Times New Roman" w:hAnsi="Times New Roman"/>
-          <w:sz w:val="24"/>
-          <w:szCs w:val="24"/>
-        </w:rPr>
-        <w:t xml:space="preserve"/>
-      </w:r>
-    </w:p>
-    <w:p>
-      <w:pPr>
-        <w:spacing w:line="276" w:lineRule="auto"/>
-      </w:pPr>
-      <w:r>
-        <w:rPr>
-          <w:rFonts w:ascii="Times New Roman" w:cs="Times New Roman" w:eastAsia="Times New Roman" w:hAnsi="Times New Roman"/>
-          <w:sz w:val="24"/>
-          <w:szCs w:val="24"/>
-        </w:rPr>
-        <w:t xml:space="preserve"/>
-      </w:r>
-    </w:p>
-    <w:p>
-      <w:pPr>
-        <w:spacing w:line="276" w:lineRule="auto"/>
-      </w:pPr>
-      <w:r>
-        <w:rPr>
-          <w:rFonts w:ascii="Times New Roman" w:cs="Times New Roman" w:eastAsia="Times New Roman" w:hAnsi="Times New Roman"/>
-          <w:sz w:val="24"/>
-          <w:szCs w:val="24"/>
+        <w:spacing w:after="0" w:before="0" w:line="240" w:lineRule="auto"/>
+      </w:pPr>
+      <w:r>
+        <w:rPr>
+          <w:rFonts w:ascii="Consolas" w:cs="Consolas" w:eastAsia="Consolas" w:hAnsi="Consolas"/>
+          <w:sz w:val="20"/>
+          <w:szCs w:val="20"/>
+        </w:rPr>
+        <w:t xml:space="preserve"/>
+      </w:r>
+    </w:p>
+    <w:p>
+      <w:pPr>
+        <w:spacing w:after="0" w:before="0" w:line="240" w:lineRule="auto"/>
+      </w:pPr>
+      <w:r>
+        <w:rPr>
+          <w:rFonts w:ascii="Consolas" w:cs="Consolas" w:eastAsia="Consolas" w:hAnsi="Consolas"/>
+          <w:sz w:val="20"/>
+          <w:szCs w:val="20"/>
         </w:rPr>
         <w:t xml:space="preserve">    for perm in itertools.permutations(range(n)):</w:t>
       </w:r>
     </w:p>
     <w:p>
       <w:pPr>
-        <w:spacing w:line="276" w:lineRule="auto"/>
-      </w:pPr>
-      <w:r>
-        <w:rPr>
-          <w:rFonts w:ascii="Times New Roman" w:cs="Times New Roman" w:eastAsia="Times New Roman" w:hAnsi="Times New Roman"/>
-          <w:sz w:val="24"/>
-          <w:szCs w:val="24"/>
-        </w:rPr>
-        <w:t xml:space="preserve"/>
-      </w:r>
-    </w:p>
-    <w:p>
-      <w:pPr>
-        <w:spacing w:line="276" w:lineRule="auto"/>
-      </w:pPr>
-      <w:r>
-        <w:rPr>
-          <w:rFonts w:ascii="Times New Roman" w:cs="Times New Roman" w:eastAsia="Times New Roman" w:hAnsi="Times New Roman"/>
-          <w:sz w:val="24"/>
-          <w:szCs w:val="24"/>
+        <w:spacing w:after="0" w:before="0" w:line="240" w:lineRule="auto"/>
+      </w:pPr>
+      <w:r>
+        <w:rPr>
+          <w:rFonts w:ascii="Consolas" w:cs="Consolas" w:eastAsia="Consolas" w:hAnsi="Consolas"/>
+          <w:sz w:val="20"/>
+          <w:szCs w:val="20"/>
         </w:rPr>
         <w:t xml:space="preserve">        cost = sum(cost_matrix[i][perm[i]] for i in range(n))</w:t>
       </w:r>
     </w:p>
     <w:p>
       <w:pPr>
-        <w:spacing w:line="276" w:lineRule="auto"/>
-      </w:pPr>
-      <w:r>
-        <w:rPr>
-          <w:rFonts w:ascii="Times New Roman" w:cs="Times New Roman" w:eastAsia="Times New Roman" w:hAnsi="Times New Roman"/>
-          <w:sz w:val="24"/>
-          <w:szCs w:val="24"/>
-        </w:rPr>
-        <w:t xml:space="preserve"/>
-      </w:r>
-    </w:p>
-    <w:p>
-      <w:pPr>
-        <w:spacing w:line="276" w:lineRule="auto"/>
-      </w:pPr>
-      <w:r>
-        <w:rPr>
-          <w:rFonts w:ascii="Times New Roman" w:cs="Times New Roman" w:eastAsia="Times New Roman" w:hAnsi="Times New Roman"/>
-          <w:sz w:val="24"/>
-          <w:szCs w:val="24"/>
-        </w:rPr>
-        <w:t xml:space="preserve"/>
-      </w:r>
-    </w:p>
-    <w:p>
-      <w:pPr>
-        <w:spacing w:line="276" w:lineRule="auto"/>
-      </w:pPr>
-      <w:r>
-        <w:rPr>
-          <w:rFonts w:ascii="Times New Roman" w:cs="Times New Roman" w:eastAsia="Times New Roman" w:hAnsi="Times New Roman"/>
-          <w:sz w:val="24"/>
-          <w:szCs w:val="24"/>
-        </w:rPr>
-        <w:t xml:space="preserve"/>
-      </w:r>
-    </w:p>
-    <w:p>
-      <w:pPr>
-        <w:spacing w:line="276" w:lineRule="auto"/>
-      </w:pPr>
-      <w:r>
-        <w:rPr>
-          <w:rFonts w:ascii="Times New Roman" w:cs="Times New Roman" w:eastAsia="Times New Roman" w:hAnsi="Times New Roman"/>
-          <w:sz w:val="24"/>
-          <w:szCs w:val="24"/>
+        <w:spacing w:after="0" w:before="0" w:line="240" w:lineRule="auto"/>
+      </w:pPr>
+      <w:r>
+        <w:rPr>
+          <w:rFonts w:ascii="Consolas" w:cs="Consolas" w:eastAsia="Consolas" w:hAnsi="Consolas"/>
+          <w:sz w:val="20"/>
+          <w:szCs w:val="20"/>
+        </w:rPr>
+        <w:t xml:space="preserve"/>
+      </w:r>
+    </w:p>
+    <w:p>
+      <w:pPr>
+        <w:spacing w:after="0" w:before="0" w:line="240" w:lineRule="auto"/>
+      </w:pPr>
+      <w:r>
+        <w:rPr>
+          <w:rFonts w:ascii="Consolas" w:cs="Consolas" w:eastAsia="Consolas" w:hAnsi="Consolas"/>
+          <w:sz w:val="20"/>
+          <w:szCs w:val="20"/>
         </w:rPr>
         <w:t xml:space="preserve">        if cost &lt; min_cost:</w:t>
       </w:r>
     </w:p>
     <w:p>
       <w:pPr>
-        <w:spacing w:line="276" w:lineRule="auto"/>
-      </w:pPr>
-      <w:r>
-        <w:rPr>
-          <w:rFonts w:ascii="Times New Roman" w:cs="Times New Roman" w:eastAsia="Times New Roman" w:hAnsi="Times New Roman"/>
-          <w:sz w:val="24"/>
-          <w:szCs w:val="24"/>
-        </w:rPr>
-        <w:t xml:space="preserve"/>
-      </w:r>
-    </w:p>
-    <w:p>
-      <w:pPr>
-        <w:spacing w:line="276" w:lineRule="auto"/>
-      </w:pPr>
-      <w:r>
-        <w:rPr>
-          <w:rFonts w:ascii="Times New Roman" w:cs="Times New Roman" w:eastAsia="Times New Roman" w:hAnsi="Times New Roman"/>
-          <w:sz w:val="24"/>
-          <w:szCs w:val="24"/>
+        <w:spacing w:after="0" w:before="0" w:line="240" w:lineRule="auto"/>
+      </w:pPr>
+      <w:r>
+        <w:rPr>
+          <w:rFonts w:ascii="Consolas" w:cs="Consolas" w:eastAsia="Consolas" w:hAnsi="Consolas"/>
+          <w:sz w:val="20"/>
+          <w:szCs w:val="20"/>
         </w:rPr>
         <w:t xml:space="preserve">            min_cost = cost</w:t>
       </w:r>
     </w:p>
     <w:p>
       <w:pPr>
-        <w:spacing w:line="276" w:lineRule="auto"/>
-      </w:pPr>
-      <w:r>
-        <w:rPr>
-          <w:rFonts w:ascii="Times New Roman" w:cs="Times New Roman" w:eastAsia="Times New Roman" w:hAnsi="Times New Roman"/>
-          <w:sz w:val="24"/>
-          <w:szCs w:val="24"/>
-        </w:rPr>
-        <w:t xml:space="preserve"/>
-      </w:r>
-    </w:p>
-    <w:p>
-      <w:pPr>
-        <w:spacing w:line="276" w:lineRule="auto"/>
-      </w:pPr>
-      <w:r>
-        <w:rPr>
-          <w:rFonts w:ascii="Times New Roman" w:cs="Times New Roman" w:eastAsia="Times New Roman" w:hAnsi="Times New Roman"/>
-          <w:sz w:val="24"/>
-          <w:szCs w:val="24"/>
+        <w:spacing w:after="0" w:before="0" w:line="240" w:lineRule="auto"/>
+      </w:pPr>
+      <w:r>
+        <w:rPr>
+          <w:rFonts w:ascii="Consolas" w:cs="Consolas" w:eastAsia="Consolas" w:hAnsi="Consolas"/>
+          <w:sz w:val="20"/>
+          <w:szCs w:val="20"/>
         </w:rPr>
         <w:t xml:space="preserve">            best_assignment = perm</w:t>
       </w:r>
     </w:p>
     <w:p>
       <w:pPr>
-        <w:spacing w:line="276" w:lineRule="auto"/>
-      </w:pPr>
-      <w:r>
-        <w:rPr>
-          <w:rFonts w:ascii="Times New Roman" w:cs="Times New Roman" w:eastAsia="Times New Roman" w:hAnsi="Times New Roman"/>
-          <w:sz w:val="24"/>
-          <w:szCs w:val="24"/>
-        </w:rPr>
-        <w:t xml:space="preserve"/>
-      </w:r>
-    </w:p>
-    <w:p>
-      <w:pPr>
-        <w:spacing w:line="276" w:lineRule="auto"/>
-      </w:pPr>
-      <w:r>
-        <w:rPr>
-          <w:rFonts w:ascii="Times New Roman" w:cs="Times New Roman" w:eastAsia="Times New Roman" w:hAnsi="Times New Roman"/>
-          <w:sz w:val="24"/>
-          <w:szCs w:val="24"/>
-        </w:rPr>
-        <w:t xml:space="preserve"/>
-      </w:r>
-    </w:p>
-    <w:p>
-      <w:pPr>
-        <w:spacing w:line="276" w:lineRule="auto"/>
-      </w:pPr>
-      <w:r>
-        <w:rPr>
-          <w:rFonts w:ascii="Times New Roman" w:cs="Times New Roman" w:eastAsia="Times New Roman" w:hAnsi="Times New Roman"/>
-          <w:sz w:val="24"/>
-          <w:szCs w:val="24"/>
-        </w:rPr>
-        <w:t xml:space="preserve"/>
-      </w:r>
-    </w:p>
-    <w:p>
-      <w:pPr>
-        <w:spacing w:line="276" w:lineRule="auto"/>
-      </w:pPr>
-      <w:r>
-        <w:rPr>
-          <w:rFonts w:ascii="Times New Roman" w:cs="Times New Roman" w:eastAsia="Times New Roman" w:hAnsi="Times New Roman"/>
-          <w:sz w:val="24"/>
-          <w:szCs w:val="24"/>
+        <w:spacing w:after="0" w:before="0" w:line="240" w:lineRule="auto"/>
+      </w:pPr>
+      <w:r>
+        <w:rPr>
+          <w:rFonts w:ascii="Consolas" w:cs="Consolas" w:eastAsia="Consolas" w:hAnsi="Consolas"/>
+          <w:sz w:val="20"/>
+          <w:szCs w:val="20"/>
+        </w:rPr>
+        <w:t xml:space="preserve"/>
+      </w:r>
+    </w:p>
+    <w:p>
+      <w:pPr>
+        <w:spacing w:after="0" w:before="0" w:line="240" w:lineRule="auto"/>
+      </w:pPr>
+      <w:r>
+        <w:rPr>
+          <w:rFonts w:ascii="Consolas" w:cs="Consolas" w:eastAsia="Consolas" w:hAnsi="Consolas"/>
+          <w:sz w:val="20"/>
+          <w:szCs w:val="20"/>
         </w:rPr>
         <w:t xml:space="preserve">    return best_assignment, min_cost</w:t>
       </w:r>
     </w:p>
     <w:p>
       <w:pPr>
-        <w:spacing w:line="276" w:lineRule="auto"/>
-      </w:pPr>
-      <w:r>
-        <w:rPr>
-          <w:rFonts w:ascii="Times New Roman" w:cs="Times New Roman" w:eastAsia="Times New Roman" w:hAnsi="Times New Roman"/>
-          <w:sz w:val="24"/>
-          <w:szCs w:val="24"/>
-        </w:rPr>
-        <w:t xml:space="preserve"/>
-      </w:r>
-    </w:p>
-    <w:p>
-      <w:pPr>
-        <w:spacing w:line="276" w:lineRule="auto"/>
-      </w:pPr>
-      <w:r>
-        <w:rPr>
-          <w:rFonts w:ascii="Times New Roman" w:cs="Times New Roman" w:eastAsia="Times New Roman" w:hAnsi="Times New Roman"/>
-          <w:sz w:val="24"/>
-          <w:szCs w:val="24"/>
-        </w:rPr>
-        <w:t xml:space="preserve"/>
-      </w:r>
-    </w:p>
-    <w:p>
-      <w:pPr>
-        <w:spacing w:line="276" w:lineRule="auto"/>
-      </w:pPr>
-      <w:r>
-        <w:rPr>
-          <w:rFonts w:ascii="Times New Roman" w:cs="Times New Roman" w:eastAsia="Times New Roman" w:hAnsi="Times New Roman"/>
-          <w:sz w:val="24"/>
-          <w:szCs w:val="24"/>
-        </w:rPr>
-        <w:t xml:space="preserve"/>
-      </w:r>
-    </w:p>
-    <w:p>
-      <w:pPr>
-        <w:spacing w:line="276" w:lineRule="auto"/>
-      </w:pPr>
-      <w:r>
-        <w:rPr>
-          <w:rFonts w:ascii="Times New Roman" w:cs="Times New Roman" w:eastAsia="Times New Roman" w:hAnsi="Times New Roman"/>
-          <w:sz w:val="24"/>
-          <w:szCs w:val="24"/>
-        </w:rPr>
-        <w:t xml:space="preserve"/>
-      </w:r>
-    </w:p>
-    <w:p>
-      <w:pPr>
-        <w:spacing w:line="276" w:lineRule="auto"/>
-      </w:pPr>
-      <w:r>
-        <w:rPr>
-          <w:rFonts w:ascii="Times New Roman" w:cs="Times New Roman" w:eastAsia="Times New Roman" w:hAnsi="Times New Roman"/>
-          <w:sz w:val="24"/>
-          <w:szCs w:val="24"/>
-        </w:rPr>
-        <w:t xml:space="preserve"/>
-      </w:r>
-    </w:p>
-    <w:p>
-      <w:pPr>
-        <w:spacing w:line="276" w:lineRule="auto"/>
-      </w:pPr>
-      <w:r>
-        <w:rPr>
-          <w:rFonts w:ascii="Times New Roman" w:cs="Times New Roman" w:eastAsia="Times New Roman" w:hAnsi="Times New Roman"/>
-          <w:sz w:val="24"/>
-          <w:szCs w:val="24"/>
+        <w:spacing w:after="0" w:before="0" w:line="240" w:lineRule="auto"/>
+      </w:pPr>
+      <w:r>
+        <w:rPr>
+          <w:rFonts w:ascii="Consolas" w:cs="Consolas" w:eastAsia="Consolas" w:hAnsi="Consolas"/>
+          <w:sz w:val="20"/>
+          <w:szCs w:val="20"/>
+        </w:rPr>
+        <w:t xml:space="preserve"/>
+      </w:r>
+    </w:p>
+    <w:p>
+      <w:pPr>
+        <w:spacing w:after="0" w:before="0" w:line="240" w:lineRule="auto"/>
+      </w:pPr>
+      <w:r>
+        <w:rPr>
+          <w:rFonts w:ascii="Consolas" w:cs="Consolas" w:eastAsia="Consolas" w:hAnsi="Consolas"/>
+          <w:sz w:val="20"/>
+          <w:szCs w:val="20"/>
+        </w:rPr>
+        <w:t xml:space="preserve"/>
+      </w:r>
+    </w:p>
+    <w:p>
+      <w:pPr>
+        <w:spacing w:after="0" w:before="0" w:line="240" w:lineRule="auto"/>
+      </w:pPr>
+      <w:r>
+        <w:rPr>
+          <w:rFonts w:ascii="Consolas" w:cs="Consolas" w:eastAsia="Consolas" w:hAnsi="Consolas"/>
+          <w:sz w:val="20"/>
+          <w:szCs w:val="20"/>
         </w:rPr>
         <w:t xml:space="preserve"># Cost matrix</w:t>
       </w:r>
     </w:p>
     <w:p>
       <w:pPr>
-        <w:spacing w:line="276" w:lineRule="auto"/>
-      </w:pPr>
-      <w:r>
-        <w:rPr>
-          <w:rFonts w:ascii="Times New Roman" w:cs="Times New Roman" w:eastAsia="Times New Roman" w:hAnsi="Times New Roman"/>
-          <w:sz w:val="24"/>
-          <w:szCs w:val="24"/>
-        </w:rPr>
-        <w:t xml:space="preserve"/>
-      </w:r>
-    </w:p>
-    <w:p>
-      <w:pPr>
-        <w:spacing w:line="276" w:lineRule="auto"/>
-      </w:pPr>
-      <w:r>
-        <w:rPr>
-          <w:rFonts w:ascii="Times New Roman" w:cs="Times New Roman" w:eastAsia="Times New Roman" w:hAnsi="Times New Roman"/>
-          <w:sz w:val="24"/>
-          <w:szCs w:val="24"/>
+        <w:spacing w:after="0" w:before="0" w:line="240" w:lineRule="auto"/>
+      </w:pPr>
+      <w:r>
+        <w:rPr>
+          <w:rFonts w:ascii="Consolas" w:cs="Consolas" w:eastAsia="Consolas" w:hAnsi="Consolas"/>
+          <w:sz w:val="20"/>
+          <w:szCs w:val="20"/>
         </w:rPr>
         <w:t xml:space="preserve">cost_matrix = [</w:t>
       </w:r>
     </w:p>
     <w:p>
       <w:pPr>
-        <w:spacing w:line="276" w:lineRule="auto"/>
-      </w:pPr>
-      <w:r>
-        <w:rPr>
-          <w:rFonts w:ascii="Times New Roman" w:cs="Times New Roman" w:eastAsia="Times New Roman" w:hAnsi="Times New Roman"/>
-          <w:sz w:val="24"/>
-          <w:szCs w:val="24"/>
-        </w:rPr>
-        <w:t xml:space="preserve"/>
-      </w:r>
-    </w:p>
-    <w:p>
-      <w:pPr>
-        <w:spacing w:line="276" w:lineRule="auto"/>
-      </w:pPr>
-      <w:r>
-        <w:rPr>
-          <w:rFonts w:ascii="Times New Roman" w:cs="Times New Roman" w:eastAsia="Times New Roman" w:hAnsi="Times New Roman"/>
-          <w:sz w:val="24"/>
-          <w:szCs w:val="24"/>
+        <w:spacing w:after="0" w:before="0" w:line="240" w:lineRule="auto"/>
+      </w:pPr>
+      <w:r>
+        <w:rPr>
+          <w:rFonts w:ascii="Consolas" w:cs="Consolas" w:eastAsia="Consolas" w:hAnsi="Consolas"/>
+          <w:sz w:val="20"/>
+          <w:szCs w:val="20"/>
         </w:rPr>
         <w:t xml:space="preserve">    [9, 2, 7, 8],</w:t>
       </w:r>
     </w:p>
     <w:p>
       <w:pPr>
-        <w:spacing w:line="276" w:lineRule="auto"/>
-      </w:pPr>
-      <w:r>
-        <w:rPr>
-          <w:rFonts w:ascii="Times New Roman" w:cs="Times New Roman" w:eastAsia="Times New Roman" w:hAnsi="Times New Roman"/>
-          <w:sz w:val="24"/>
-          <w:szCs w:val="24"/>
-        </w:rPr>
-        <w:t xml:space="preserve"/>
-      </w:r>
-    </w:p>
-    <w:p>
-      <w:pPr>
-        <w:spacing w:line="276" w:lineRule="auto"/>
-      </w:pPr>
-      <w:r>
-        <w:rPr>
-          <w:rFonts w:ascii="Times New Roman" w:cs="Times New Roman" w:eastAsia="Times New Roman" w:hAnsi="Times New Roman"/>
-          <w:sz w:val="24"/>
-          <w:szCs w:val="24"/>
+        <w:spacing w:after="0" w:before="0" w:line="240" w:lineRule="auto"/>
+      </w:pPr>
+      <w:r>
+        <w:rPr>
+          <w:rFonts w:ascii="Consolas" w:cs="Consolas" w:eastAsia="Consolas" w:hAnsi="Consolas"/>
+          <w:sz w:val="20"/>
+          <w:szCs w:val="20"/>
         </w:rPr>
         <w:t xml:space="preserve">    [6, 4, 3, 7],</w:t>
       </w:r>
     </w:p>
     <w:p>
       <w:pPr>
-        <w:spacing w:line="276" w:lineRule="auto"/>
-      </w:pPr>
-      <w:r>
-        <w:rPr>
-          <w:rFonts w:ascii="Times New Roman" w:cs="Times New Roman" w:eastAsia="Times New Roman" w:hAnsi="Times New Roman"/>
-          <w:sz w:val="24"/>
-          <w:szCs w:val="24"/>
-        </w:rPr>
-        <w:t xml:space="preserve"/>
-      </w:r>
-    </w:p>
-    <w:p>
-      <w:pPr>
-        <w:spacing w:line="276" w:lineRule="auto"/>
-      </w:pPr>
-      <w:r>
-        <w:rPr>
-          <w:rFonts w:ascii="Times New Roman" w:cs="Times New Roman" w:eastAsia="Times New Roman" w:hAnsi="Times New Roman"/>
-          <w:sz w:val="24"/>
-          <w:szCs w:val="24"/>
+        <w:spacing w:after="0" w:before="0" w:line="240" w:lineRule="auto"/>
+      </w:pPr>
+      <w:r>
+        <w:rPr>
+          <w:rFonts w:ascii="Consolas" w:cs="Consolas" w:eastAsia="Consolas" w:hAnsi="Consolas"/>
+          <w:sz w:val="20"/>
+          <w:szCs w:val="20"/>
         </w:rPr>
         <w:t xml:space="preserve">    [5, 8, 1, 8],</w:t>
       </w:r>
     </w:p>
     <w:p>
       <w:pPr>
-        <w:spacing w:line="276" w:lineRule="auto"/>
-      </w:pPr>
-      <w:r>
-        <w:rPr>
-          <w:rFonts w:ascii="Times New Roman" w:cs="Times New Roman" w:eastAsia="Times New Roman" w:hAnsi="Times New Roman"/>
-          <w:sz w:val="24"/>
-          <w:szCs w:val="24"/>
-        </w:rPr>
-        <w:t xml:space="preserve"/>
-      </w:r>
-    </w:p>
-    <w:p>
-      <w:pPr>
-        <w:spacing w:line="276" w:lineRule="auto"/>
-      </w:pPr>
-      <w:r>
-        <w:rPr>
-          <w:rFonts w:ascii="Times New Roman" w:cs="Times New Roman" w:eastAsia="Times New Roman" w:hAnsi="Times New Roman"/>
-          <w:sz w:val="24"/>
-          <w:szCs w:val="24"/>
+        <w:spacing w:after="0" w:before="0" w:line="240" w:lineRule="auto"/>
+      </w:pPr>
+      <w:r>
+        <w:rPr>
+          <w:rFonts w:ascii="Consolas" w:cs="Consolas" w:eastAsia="Consolas" w:hAnsi="Consolas"/>
+          <w:sz w:val="20"/>
+          <w:szCs w:val="20"/>
         </w:rPr>
         <w:t xml:space="preserve">    [7, 6, 9, 4]</w:t>
       </w:r>
     </w:p>
     <w:p>
       <w:pPr>
-        <w:spacing w:line="276" w:lineRule="auto"/>
-      </w:pPr>
-      <w:r>
-        <w:rPr>
-          <w:rFonts w:ascii="Times New Roman" w:cs="Times New Roman" w:eastAsia="Times New Roman" w:hAnsi="Times New Roman"/>
-          <w:sz w:val="24"/>
-          <w:szCs w:val="24"/>
-        </w:rPr>
-        <w:t xml:space="preserve"/>
-      </w:r>
-    </w:p>
-    <w:p>
-      <w:pPr>
-        <w:spacing w:line="276" w:lineRule="auto"/>
-      </w:pPr>
-      <w:r>
-        <w:rPr>
-          <w:rFonts w:ascii="Times New Roman" w:cs="Times New Roman" w:eastAsia="Times New Roman" w:hAnsi="Times New Roman"/>
-          <w:sz w:val="24"/>
-          <w:szCs w:val="24"/>
+        <w:spacing w:after="0" w:before="0" w:line="240" w:lineRule="auto"/>
+      </w:pPr>
+      <w:r>
+        <w:rPr>
+          <w:rFonts w:ascii="Consolas" w:cs="Consolas" w:eastAsia="Consolas" w:hAnsi="Consolas"/>
+          <w:sz w:val="20"/>
+          <w:szCs w:val="20"/>
         </w:rPr>
         <w:t xml:space="preserve">]</w:t>
       </w:r>
     </w:p>
     <w:p>
       <w:pPr>
-        <w:spacing w:line="276" w:lineRule="auto"/>
-      </w:pPr>
-      <w:r>
-        <w:rPr>
-          <w:rFonts w:ascii="Times New Roman" w:cs="Times New Roman" w:eastAsia="Times New Roman" w:hAnsi="Times New Roman"/>
-          <w:sz w:val="24"/>
-          <w:szCs w:val="24"/>
-        </w:rPr>
-        <w:t xml:space="preserve"/>
-      </w:r>
-    </w:p>
-    <w:p>
-      <w:pPr>
-        <w:spacing w:line="276" w:lineRule="auto"/>
-      </w:pPr>
-      <w:r>
-        <w:rPr>
-          <w:rFonts w:ascii="Times New Roman" w:cs="Times New Roman" w:eastAsia="Times New Roman" w:hAnsi="Times New Roman"/>
-          <w:sz w:val="24"/>
-          <w:szCs w:val="24"/>
-        </w:rPr>
-        <w:t xml:space="preserve"/>
-      </w:r>
-    </w:p>
-    <w:p>
-      <w:pPr>
-        <w:spacing w:line="276" w:lineRule="auto"/>
-      </w:pPr>
-      <w:r>
-        <w:rPr>
-          <w:rFonts w:ascii="Times New Roman" w:cs="Times New Roman" w:eastAsia="Times New Roman" w:hAnsi="Times New Roman"/>
-          <w:sz w:val="24"/>
-          <w:szCs w:val="24"/>
-        </w:rPr>
-        <w:t xml:space="preserve"/>
-      </w:r>
-    </w:p>
-    <w:p>
-      <w:pPr>
-        <w:spacing w:line="276" w:lineRule="auto"/>
-      </w:pPr>
-      <w:r>
-        <w:rPr>
-          <w:rFonts w:ascii="Times New Roman" w:cs="Times New Roman" w:eastAsia="Times New Roman" w:hAnsi="Times New Roman"/>
-          <w:sz w:val="24"/>
-          <w:szCs w:val="24"/>
+        <w:spacing w:after="0" w:before="0" w:line="240" w:lineRule="auto"/>
+      </w:pPr>
+      <w:r>
+        <w:rPr>
+          <w:rFonts w:ascii="Consolas" w:cs="Consolas" w:eastAsia="Consolas" w:hAnsi="Consolas"/>
+          <w:sz w:val="20"/>
+          <w:szCs w:val="20"/>
+        </w:rPr>
+        <w:t xml:space="preserve"/>
+      </w:r>
+    </w:p>
+    <w:p>
+      <w:pPr>
+        <w:spacing w:after="0" w:before="0" w:line="240" w:lineRule="auto"/>
+      </w:pPr>
+      <w:r>
+        <w:rPr>
+          <w:rFonts w:ascii="Consolas" w:cs="Consolas" w:eastAsia="Consolas" w:hAnsi="Consolas"/>
+          <w:sz w:val="20"/>
+          <w:szCs w:val="20"/>
         </w:rPr>
         <w:t xml:space="preserve"># Find the optimal assignment</w:t>
       </w:r>
     </w:p>
     <w:p>
       <w:pPr>
-        <w:spacing w:line="276" w:lineRule="auto"/>
-      </w:pPr>
-      <w:r>
-        <w:rPr>
-          <w:rFonts w:ascii="Times New Roman" w:cs="Times New Roman" w:eastAsia="Times New Roman" w:hAnsi="Times New Roman"/>
-          <w:sz w:val="24"/>
-          <w:szCs w:val="24"/>
-        </w:rPr>
-        <w:t xml:space="preserve"/>
-      </w:r>
-    </w:p>
-    <w:p>
-      <w:pPr>
-        <w:spacing w:line="276" w:lineRule="auto"/>
-      </w:pPr>
-      <w:r>
-        <w:rPr>
-          <w:rFonts w:ascii="Times New Roman" w:cs="Times New Roman" w:eastAsia="Times New Roman" w:hAnsi="Times New Roman"/>
-          <w:sz w:val="24"/>
-          <w:szCs w:val="24"/>
+        <w:spacing w:after="0" w:before="0" w:line="240" w:lineRule="auto"/>
+      </w:pPr>
+      <w:r>
+        <w:rPr>
+          <w:rFonts w:ascii="Consolas" w:cs="Consolas" w:eastAsia="Consolas" w:hAnsi="Consolas"/>
+          <w:sz w:val="20"/>
+          <w:szCs w:val="20"/>
         </w:rPr>
         <w:t xml:space="preserve">assignment, cost = assignment_bruteforce(cost_matrix)</w:t>
       </w:r>
     </w:p>
     <w:p>
       <w:pPr>
-        <w:spacing w:line="276" w:lineRule="auto"/>
-      </w:pPr>
-      <w:r>
-        <w:rPr>
-          <w:rFonts w:ascii="Times New Roman" w:cs="Times New Roman" w:eastAsia="Times New Roman" w:hAnsi="Times New Roman"/>
-          <w:sz w:val="24"/>
-          <w:szCs w:val="24"/>
-        </w:rPr>
-        <w:t xml:space="preserve"/>
-      </w:r>
-    </w:p>
-    <w:p>
-      <w:pPr>
-        <w:spacing w:line="276" w:lineRule="auto"/>
-      </w:pPr>
-      <w:r>
-        <w:rPr>
-          <w:rFonts w:ascii="Times New Roman" w:cs="Times New Roman" w:eastAsia="Times New Roman" w:hAnsi="Times New Roman"/>
-          <w:sz w:val="24"/>
-          <w:szCs w:val="24"/>
-        </w:rPr>
-        <w:t xml:space="preserve"/>
-      </w:r>
-    </w:p>
-    <w:p>
-      <w:pPr>
-        <w:spacing w:line="276" w:lineRule="auto"/>
-      </w:pPr>
-      <w:r>
-        <w:rPr>
-          <w:rFonts w:ascii="Times New Roman" w:cs="Times New Roman" w:eastAsia="Times New Roman" w:hAnsi="Times New Roman"/>
-          <w:sz w:val="24"/>
-          <w:szCs w:val="24"/>
-        </w:rPr>
-        <w:t xml:space="preserve"/>
-      </w:r>
-    </w:p>
-    <w:p>
-      <w:pPr>
-        <w:spacing w:line="276" w:lineRule="auto"/>
-      </w:pPr>
-      <w:r>
-        <w:rPr>
-          <w:rFonts w:ascii="Times New Roman" w:cs="Times New Roman" w:eastAsia="Times New Roman" w:hAnsi="Times New Roman"/>
-          <w:sz w:val="24"/>
-          <w:szCs w:val="24"/>
+        <w:spacing w:after="0" w:before="0" w:line="240" w:lineRule="auto"/>
+      </w:pPr>
+      <w:r>
+        <w:rPr>
+          <w:rFonts w:ascii="Consolas" w:cs="Consolas" w:eastAsia="Consolas" w:hAnsi="Consolas"/>
+          <w:sz w:val="20"/>
+          <w:szCs w:val="20"/>
+        </w:rPr>
+        <w:t xml:space="preserve"/>
+      </w:r>
+    </w:p>
+    <w:p>
+      <w:pPr>
+        <w:spacing w:after="0" w:before="0" w:line="240" w:lineRule="auto"/>
+      </w:pPr>
+      <w:r>
+        <w:rPr>
+          <w:rFonts w:ascii="Consolas" w:cs="Consolas" w:eastAsia="Consolas" w:hAnsi="Consolas"/>
+          <w:sz w:val="20"/>
+          <w:szCs w:val="20"/>
         </w:rPr>
         <w:t xml:space="preserve">print("Best Assignment:", assignment)</w:t>
       </w:r>
     </w:p>
     <w:p>
       <w:pPr>
-        <w:spacing w:line="276" w:lineRule="auto"/>
-      </w:pPr>
-      <w:r>
-        <w:rPr>
-          <w:rFonts w:ascii="Times New Roman" w:cs="Times New Roman" w:eastAsia="Times New Roman" w:hAnsi="Times New Roman"/>
-          <w:sz w:val="24"/>
-          <w:szCs w:val="24"/>
-        </w:rPr>
-        <w:t xml:space="preserve"/>
-      </w:r>
-    </w:p>
-    <w:p>
-      <w:pPr>
-        <w:spacing w:line="276" w:lineRule="auto"/>
-      </w:pPr>
-      <w:r>
-        <w:rPr>
-          <w:rFonts w:ascii="Times New Roman" w:cs="Times New Roman" w:eastAsia="Times New Roman" w:hAnsi="Times New Roman"/>
-          <w:sz w:val="24"/>
-          <w:szCs w:val="24"/>
+        <w:spacing w:after="0" w:before="0" w:line="240" w:lineRule="auto"/>
+      </w:pPr>
+      <w:r>
+        <w:rPr>
+          <w:rFonts w:ascii="Consolas" w:cs="Consolas" w:eastAsia="Consolas" w:hAnsi="Consolas"/>
+          <w:sz w:val="20"/>
+          <w:szCs w:val="20"/>
         </w:rPr>
         <w:t xml:space="preserve">print("Minimum Cost:", cost)</w:t>
       </w:r>
@@ -984,52 +585,26 @@
     </w:p>
     <w:p>
       <w:pPr>
-        <w:spacing w:line="276" w:lineRule="auto"/>
-      </w:pPr>
-      <w:r>
-        <w:rPr>
-          <w:rFonts w:ascii="Times New Roman" w:cs="Times New Roman" w:eastAsia="Times New Roman" w:hAnsi="Times New Roman"/>
-          <w:sz w:val="24"/>
-          <w:szCs w:val="24"/>
-        </w:rPr>
-        <w:t xml:space="preserve"/>
-      </w:r>
-    </w:p>
-    <w:p>
-      <w:pPr>
-        <w:spacing w:line="276" w:lineRule="auto"/>
-      </w:pPr>
-      <w:r>
-        <w:rPr>
-          <w:rFonts w:ascii="Times New Roman" w:cs="Times New Roman" w:eastAsia="Times New Roman" w:hAnsi="Times New Roman"/>
-          <w:sz w:val="24"/>
-          <w:szCs w:val="24"/>
+        <w:spacing w:after="0" w:before="0" w:line="240" w:lineRule="auto"/>
+      </w:pPr>
+      <w:r>
+        <w:rPr>
+          <w:rFonts w:ascii="Consolas" w:cs="Consolas" w:eastAsia="Consolas" w:hAnsi="Consolas"/>
+          <w:sz w:val="20"/>
+          <w:szCs w:val="20"/>
         </w:rPr>
         <w:t xml:space="preserve">Best Assignment: (1, 2, 3, 0)</w:t>
       </w:r>
     </w:p>
     <w:p>
       <w:pPr>
-        <w:spacing w:line="276" w:lineRule="auto"/>
-      </w:pPr>
-      <w:r>
-        <w:rPr>
-          <w:rFonts w:ascii="Times New Roman" w:cs="Times New Roman" w:eastAsia="Times New Roman" w:hAnsi="Times New Roman"/>
-          <w:sz w:val="24"/>
-          <w:szCs w:val="24"/>
-        </w:rPr>
-        <w:t xml:space="preserve"/>
-      </w:r>
-    </w:p>
-    <w:p>
-      <w:pPr>
-        <w:spacing w:line="276" w:lineRule="auto"/>
-      </w:pPr>
-      <w:r>
-        <w:rPr>
-          <w:rFonts w:ascii="Times New Roman" w:cs="Times New Roman" w:eastAsia="Times New Roman" w:hAnsi="Times New Roman"/>
-          <w:sz w:val="24"/>
-          <w:szCs w:val="24"/>
+        <w:spacing w:after="0" w:before="0" w:line="240" w:lineRule="auto"/>
+      </w:pPr>
+      <w:r>
+        <w:rPr>
+          <w:rFonts w:ascii="Consolas" w:cs="Consolas" w:eastAsia="Consolas" w:hAnsi="Consolas"/>
+          <w:sz w:val="20"/>
+          <w:szCs w:val="20"/>
         </w:rPr>
         <w:t xml:space="preserve">Minimum Cost: 21</w:t>
       </w:r>
@@ -1421,13 +996,13 @@
     <w:sectPr>
       <w:headerReference w:type="default" r:id="rId7"/>
       <w:footerReference w:type="default" r:id="rId8"/>
-      <w:pgSz w:w="12240" w:h="15840" w:orient="portrait"/>
-      <w:pgMar w:top="1440" w:right="1440" w:bottom="1440" w:left="1440" w:header="720" w:footer="720" w:gutter="0"/>
-      <w:pgBorders>
-        <w:top w:val="thinThickSmallGap" w:color="000000" w:sz="24" w:space="1"/>
-        <w:left w:val="thinThickSmallGap" w:color="000000" w:sz="24" w:space="4"/>
-        <w:bottom w:val="thickThinSmallGap" w:color="000000" w:sz="24" w:space="1"/>
-        <w:right w:val="thickThinSmallGap" w:color="000000" w:sz="24" w:space="4"/>
+      <w:pgSz w:w="11906" w:h="16838" w:orient="portrait"/>
+      <w:pgMar w:top="1440" w:right="1440" w:bottom="1440" w:left="1440" w:header="708" w:footer="708" w:gutter="0"/>
+      <w:pgBorders w:display="allPages" w:offsetFrom="text">
+        <w:top w:val="thinThickSmallGap" w:color="auto" w:sz="24" w:space="1"/>
+        <w:left w:val="thinThickSmallGap" w:color="auto" w:sz="24" w:space="4"/>
+        <w:bottom w:val="thickThinSmallGap" w:color="auto" w:sz="24" w:space="1"/>
+        <w:right w:val="thickThinSmallGap" w:color="auto" w:sz="24" w:space="4"/>
       </w:pgBorders>
       <w:pgNumType/>
       <w:docGrid w:linePitch="360"/>
@@ -1482,6 +1057,7 @@
   <w:p>
     <w:r>
       <w:rPr>
+        <w:rFonts w:ascii="Times New Roman" w:cs="Times New Roman" w:eastAsia="Times New Roman" w:hAnsi="Times New Roman"/>
         <w:b/>
         <w:bCs/>
         <w:sz w:val="20"/>
@@ -1493,10 +1069,18 @@
       <w:rPr>
         <w:b/>
         <w:bCs/>
+      </w:rPr>
+      <w:ptab w:relativeTo="indent" w:alignment="right" w:leader="none"/>
+    </w:r>
+    <w:r>
+      <w:rPr>
+        <w:rFonts w:ascii="Times New Roman" w:cs="Times New Roman" w:eastAsia="Times New Roman" w:hAnsi="Times New Roman"/>
+        <w:b/>
+        <w:bCs/>
         <w:sz w:val="20"/>
         <w:szCs w:val="20"/>
       </w:rPr>
-      <w:t xml:space="preserve">			Advanced Algorithms Lab</w:t>
+      <w:t xml:space="preserve">Advanced Algorithms Lab</w:t>
     </w:r>
   </w:p>
 </w:ftr>
@@ -1554,13 +1138,20 @@
     </w:r>
     <w:r>
       <w:rPr>
+        <w:b/>
+        <w:bCs/>
+      </w:rPr>
+      <w:ptab w:relativeTo="indent" w:alignment="right" w:leader="none"/>
+    </w:r>
+    <w:r>
+      <w:rPr>
         <w:rFonts w:ascii="Verdana" w:cs="Verdana" w:eastAsia="Verdana" w:hAnsi="Verdana"/>
         <w:b/>
         <w:bCs/>
         <w:sz w:val="20"/>
         <w:szCs w:val="20"/>
       </w:rPr>
-      <w:t xml:space="preserve">	                                                          Roll No:</w:t>
+      <w:t xml:space="preserve">Roll No:</w:t>
     </w:r>
   </w:p>
 </w:hdr>

</xml_diff>

<commit_message>
refactor: remove redundant whitespace and consolidate multi-line expressions across all experiment scripts
</commit_message>
<xml_diff>
--- a/outputs/lab_record_recreated.docx
+++ b/outputs/lab_record_recreated.docx
@@ -173,19 +173,6 @@
           <w:sz w:val="20"/>
           <w:szCs w:val="20"/>
         </w:rPr>
-        <w:t xml:space="preserve"/>
-      </w:r>
-    </w:p>
-    <w:p>
-      <w:pPr>
-        <w:spacing w:after="0" w:before="0" w:line="240" w:lineRule="auto"/>
-      </w:pPr>
-      <w:r>
-        <w:rPr>
-          <w:rFonts w:ascii="Consolas" w:cs="Consolas" w:eastAsia="Consolas" w:hAnsi="Consolas"/>
-          <w:sz w:val="20"/>
-          <w:szCs w:val="20"/>
-        </w:rPr>
         <w:t xml:space="preserve">def assignment_bruteforce(cost_matrix):</w:t>
       </w:r>
     </w:p>
@@ -238,19 +225,6 @@
           <w:sz w:val="20"/>
           <w:szCs w:val="20"/>
         </w:rPr>
-        <w:t xml:space="preserve"/>
-      </w:r>
-    </w:p>
-    <w:p>
-      <w:pPr>
-        <w:spacing w:after="0" w:before="0" w:line="240" w:lineRule="auto"/>
-      </w:pPr>
-      <w:r>
-        <w:rPr>
-          <w:rFonts w:ascii="Consolas" w:cs="Consolas" w:eastAsia="Consolas" w:hAnsi="Consolas"/>
-          <w:sz w:val="20"/>
-          <w:szCs w:val="20"/>
-        </w:rPr>
         <w:t xml:space="preserve">    for perm in itertools.permutations(range(n)):</w:t>
       </w:r>
     </w:p>
@@ -277,19 +251,6 @@
           <w:sz w:val="20"/>
           <w:szCs w:val="20"/>
         </w:rPr>
-        <w:t xml:space="preserve"/>
-      </w:r>
-    </w:p>
-    <w:p>
-      <w:pPr>
-        <w:spacing w:after="0" w:before="0" w:line="240" w:lineRule="auto"/>
-      </w:pPr>
-      <w:r>
-        <w:rPr>
-          <w:rFonts w:ascii="Consolas" w:cs="Consolas" w:eastAsia="Consolas" w:hAnsi="Consolas"/>
-          <w:sz w:val="20"/>
-          <w:szCs w:val="20"/>
-        </w:rPr>
         <w:t xml:space="preserve">        if cost &lt; min_cost:</w:t>
       </w:r>
     </w:p>
@@ -329,19 +290,6 @@
           <w:sz w:val="20"/>
           <w:szCs w:val="20"/>
         </w:rPr>
-        <w:t xml:space="preserve"/>
-      </w:r>
-    </w:p>
-    <w:p>
-      <w:pPr>
-        <w:spacing w:after="0" w:before="0" w:line="240" w:lineRule="auto"/>
-      </w:pPr>
-      <w:r>
-        <w:rPr>
-          <w:rFonts w:ascii="Consolas" w:cs="Consolas" w:eastAsia="Consolas" w:hAnsi="Consolas"/>
-          <w:sz w:val="20"/>
-          <w:szCs w:val="20"/>
-        </w:rPr>
         <w:t xml:space="preserve">    return best_assignment, min_cost</w:t>
       </w:r>
     </w:p>
@@ -355,19 +303,6 @@
           <w:sz w:val="20"/>
           <w:szCs w:val="20"/>
         </w:rPr>
-        <w:t xml:space="preserve"/>
-      </w:r>
-    </w:p>
-    <w:p>
-      <w:pPr>
-        <w:spacing w:after="0" w:before="0" w:line="240" w:lineRule="auto"/>
-      </w:pPr>
-      <w:r>
-        <w:rPr>
-          <w:rFonts w:ascii="Consolas" w:cs="Consolas" w:eastAsia="Consolas" w:hAnsi="Consolas"/>
-          <w:sz w:val="20"/>
-          <w:szCs w:val="20"/>
-        </w:rPr>
         <w:t xml:space="preserve">cost_matrix = [</w:t>
       </w:r>
     </w:p>
@@ -446,19 +381,6 @@
           <w:sz w:val="20"/>
           <w:szCs w:val="20"/>
         </w:rPr>
-        <w:t xml:space="preserve"/>
-      </w:r>
-    </w:p>
-    <w:p>
-      <w:pPr>
-        <w:spacing w:after="0" w:before="0" w:line="240" w:lineRule="auto"/>
-      </w:pPr>
-      <w:r>
-        <w:rPr>
-          <w:rFonts w:ascii="Consolas" w:cs="Consolas" w:eastAsia="Consolas" w:hAnsi="Consolas"/>
-          <w:sz w:val="20"/>
-          <w:szCs w:val="20"/>
-        </w:rPr>
         <w:t xml:space="preserve">assignment, cost = assignment_bruteforce(cost_matrix)</w:t>
       </w:r>
     </w:p>
@@ -472,19 +394,6 @@
           <w:sz w:val="20"/>
           <w:szCs w:val="20"/>
         </w:rPr>
-        <w:t xml:space="preserve"/>
-      </w:r>
-    </w:p>
-    <w:p>
-      <w:pPr>
-        <w:spacing w:after="0" w:before="0" w:line="240" w:lineRule="auto"/>
-      </w:pPr>
-      <w:r>
-        <w:rPr>
-          <w:rFonts w:ascii="Consolas" w:cs="Consolas" w:eastAsia="Consolas" w:hAnsi="Consolas"/>
-          <w:sz w:val="20"/>
-          <w:szCs w:val="20"/>
-        </w:rPr>
         <w:t xml:space="preserve">print("Best Assignment:", assignment)</w:t>
       </w:r>
     </w:p>
@@ -826,19 +735,6 @@
           <w:sz w:val="20"/>
           <w:szCs w:val="20"/>
         </w:rPr>
-        <w:t xml:space="preserve"/>
-      </w:r>
-    </w:p>
-    <w:p>
-      <w:pPr>
-        <w:spacing w:after="0" w:before="0" w:line="240" w:lineRule="auto"/>
-      </w:pPr>
-      <w:r>
-        <w:rPr>
-          <w:rFonts w:ascii="Consolas" w:cs="Consolas" w:eastAsia="Consolas" w:hAnsi="Consolas"/>
-          <w:sz w:val="20"/>
-          <w:szCs w:val="20"/>
-        </w:rPr>
         <w:t xml:space="preserve">    m = min(len(str(x)), len(str(y))) // 2</w:t>
       </w:r>
     </w:p>
@@ -852,19 +748,6 @@
           <w:sz w:val="20"/>
           <w:szCs w:val="20"/>
         </w:rPr>
-        <w:t xml:space="preserve"/>
-      </w:r>
-    </w:p>
-    <w:p>
-      <w:pPr>
-        <w:spacing w:after="0" w:before="0" w:line="240" w:lineRule="auto"/>
-      </w:pPr>
-      <w:r>
-        <w:rPr>
-          <w:rFonts w:ascii="Consolas" w:cs="Consolas" w:eastAsia="Consolas" w:hAnsi="Consolas"/>
-          <w:sz w:val="20"/>
-          <w:szCs w:val="20"/>
-        </w:rPr>
         <w:t xml:space="preserve">    high_x, low_x = divmod(x, 10**m)</w:t>
       </w:r>
     </w:p>
@@ -891,19 +774,6 @@
           <w:sz w:val="20"/>
           <w:szCs w:val="20"/>
         </w:rPr>
-        <w:t xml:space="preserve"/>
-      </w:r>
-    </w:p>
-    <w:p>
-      <w:pPr>
-        <w:spacing w:after="0" w:before="0" w:line="240" w:lineRule="auto"/>
-      </w:pPr>
-      <w:r>
-        <w:rPr>
-          <w:rFonts w:ascii="Consolas" w:cs="Consolas" w:eastAsia="Consolas" w:hAnsi="Consolas"/>
-          <w:sz w:val="20"/>
-          <w:szCs w:val="20"/>
-        </w:rPr>
         <w:t xml:space="preserve">    z0 = karatsuba(low_x, low_y)</w:t>
       </w:r>
     </w:p>
@@ -943,19 +813,6 @@
           <w:sz w:val="20"/>
           <w:szCs w:val="20"/>
         </w:rPr>
-        <w:t xml:space="preserve"/>
-      </w:r>
-    </w:p>
-    <w:p>
-      <w:pPr>
-        <w:spacing w:after="0" w:before="0" w:line="240" w:lineRule="auto"/>
-      </w:pPr>
-      <w:r>
-        <w:rPr>
-          <w:rFonts w:ascii="Consolas" w:cs="Consolas" w:eastAsia="Consolas" w:hAnsi="Consolas"/>
-          <w:sz w:val="20"/>
-          <w:szCs w:val="20"/>
-        </w:rPr>
         <w:t xml:space="preserve">    return z2 * 10**(2 * m) + (z1 - z2 - z0) * 10**m + z0</w:t>
       </w:r>
     </w:p>
@@ -969,19 +826,6 @@
           <w:sz w:val="20"/>
           <w:szCs w:val="20"/>
         </w:rPr>
-        <w:t xml:space="preserve"/>
-      </w:r>
-    </w:p>
-    <w:p>
-      <w:pPr>
-        <w:spacing w:after="0" w:before="0" w:line="240" w:lineRule="auto"/>
-      </w:pPr>
-      <w:r>
-        <w:rPr>
-          <w:rFonts w:ascii="Consolas" w:cs="Consolas" w:eastAsia="Consolas" w:hAnsi="Consolas"/>
-          <w:sz w:val="20"/>
-          <w:szCs w:val="20"/>
-        </w:rPr>
         <w:t xml:space="preserve">x = 4321</w:t>
       </w:r>
     </w:p>
@@ -1008,19 +852,6 @@
           <w:sz w:val="20"/>
           <w:szCs w:val="20"/>
         </w:rPr>
-        <w:t xml:space="preserve"/>
-      </w:r>
-    </w:p>
-    <w:p>
-      <w:pPr>
-        <w:spacing w:after="0" w:before="0" w:line="240" w:lineRule="auto"/>
-      </w:pPr>
-      <w:r>
-        <w:rPr>
-          <w:rFonts w:ascii="Consolas" w:cs="Consolas" w:eastAsia="Consolas" w:hAnsi="Consolas"/>
-          <w:sz w:val="20"/>
-          <w:szCs w:val="20"/>
-        </w:rPr>
         <w:t xml:space="preserve">result = karatsuba(x, y)</w:t>
       </w:r>
     </w:p>
@@ -1034,19 +865,6 @@
           <w:sz w:val="20"/>
           <w:szCs w:val="20"/>
         </w:rPr>
-        <w:t xml:space="preserve"/>
-      </w:r>
-    </w:p>
-    <w:p>
-      <w:pPr>
-        <w:spacing w:after="0" w:before="0" w:line="240" w:lineRule="auto"/>
-      </w:pPr>
-      <w:r>
-        <w:rPr>
-          <w:rFonts w:ascii="Consolas" w:cs="Consolas" w:eastAsia="Consolas" w:hAnsi="Consolas"/>
-          <w:sz w:val="20"/>
-          <w:szCs w:val="20"/>
-        </w:rPr>
         <w:t xml:space="preserve">print("First Number :", x)</w:t>
       </w:r>
     </w:p>
@@ -1373,46 +1191,7 @@
           <w:sz w:val="20"/>
           <w:szCs w:val="20"/>
         </w:rPr>
-        <w:t xml:space="preserve"/>
-      </w:r>
-    </w:p>
-    <w:p>
-      <w:pPr>
-        <w:spacing w:after="0" w:before="0" w:line="240" w:lineRule="auto"/>
-      </w:pPr>
-      <w:r>
-        <w:rPr>
-          <w:rFonts w:ascii="Consolas" w:cs="Consolas" w:eastAsia="Consolas" w:hAnsi="Consolas"/>
-          <w:sz w:val="20"/>
-          <w:szCs w:val="20"/>
-        </w:rPr>
-        <w:t xml:space="preserve">    ratio = [(values[i] / weights[i], weights[i], values[i])</w:t>
-      </w:r>
-    </w:p>
-    <w:p>
-      <w:pPr>
-        <w:spacing w:after="0" w:before="0" w:line="240" w:lineRule="auto"/>
-      </w:pPr>
-      <w:r>
-        <w:rPr>
-          <w:rFonts w:ascii="Consolas" w:cs="Consolas" w:eastAsia="Consolas" w:hAnsi="Consolas"/>
-          <w:sz w:val="20"/>
-          <w:szCs w:val="20"/>
-        </w:rPr>
-        <w:t xml:space="preserve">             for i in range(n)]</w:t>
-      </w:r>
-    </w:p>
-    <w:p>
-      <w:pPr>
-        <w:spacing w:after="0" w:before="0" w:line="240" w:lineRule="auto"/>
-      </w:pPr>
-      <w:r>
-        <w:rPr>
-          <w:rFonts w:ascii="Consolas" w:cs="Consolas" w:eastAsia="Consolas" w:hAnsi="Consolas"/>
-          <w:sz w:val="20"/>
-          <w:szCs w:val="20"/>
-        </w:rPr>
-        <w:t xml:space="preserve"/>
+        <w:t xml:space="preserve">    ratio = [(values[i] / weights[i], weights[i], values[i]) for i in range(n)]</w:t>
       </w:r>
     </w:p>
     <w:p>
@@ -1438,19 +1217,6 @@
           <w:sz w:val="20"/>
           <w:szCs w:val="20"/>
         </w:rPr>
-        <w:t xml:space="preserve"/>
-      </w:r>
-    </w:p>
-    <w:p>
-      <w:pPr>
-        <w:spacing w:after="0" w:before="0" w:line="240" w:lineRule="auto"/>
-      </w:pPr>
-      <w:r>
-        <w:rPr>
-          <w:rFonts w:ascii="Consolas" w:cs="Consolas" w:eastAsia="Consolas" w:hAnsi="Consolas"/>
-          <w:sz w:val="20"/>
-          <w:szCs w:val="20"/>
-        </w:rPr>
         <w:t xml:space="preserve">    total_value = 0</w:t>
       </w:r>
     </w:p>
@@ -1464,19 +1230,6 @@
           <w:sz w:val="20"/>
           <w:szCs w:val="20"/>
         </w:rPr>
-        <w:t xml:space="preserve"/>
-      </w:r>
-    </w:p>
-    <w:p>
-      <w:pPr>
-        <w:spacing w:after="0" w:before="0" w:line="240" w:lineRule="auto"/>
-      </w:pPr>
-      <w:r>
-        <w:rPr>
-          <w:rFonts w:ascii="Consolas" w:cs="Consolas" w:eastAsia="Consolas" w:hAnsi="Consolas"/>
-          <w:sz w:val="20"/>
-          <w:szCs w:val="20"/>
-        </w:rPr>
         <w:t xml:space="preserve">    for r, w, v in ratio:</w:t>
       </w:r>
     </w:p>
@@ -1490,19 +1243,6 @@
           <w:sz w:val="20"/>
           <w:szCs w:val="20"/>
         </w:rPr>
-        <w:t xml:space="preserve"/>
-      </w:r>
-    </w:p>
-    <w:p>
-      <w:pPr>
-        <w:spacing w:after="0" w:before="0" w:line="240" w:lineRule="auto"/>
-      </w:pPr>
-      <w:r>
-        <w:rPr>
-          <w:rFonts w:ascii="Consolas" w:cs="Consolas" w:eastAsia="Consolas" w:hAnsi="Consolas"/>
-          <w:sz w:val="20"/>
-          <w:szCs w:val="20"/>
-        </w:rPr>
         <w:t xml:space="preserve">        if capacity - w &gt;= 0:</w:t>
       </w:r>
     </w:p>
@@ -1542,19 +1282,6 @@
           <w:sz w:val="20"/>
           <w:szCs w:val="20"/>
         </w:rPr>
-        <w:t xml:space="preserve"/>
-      </w:r>
-    </w:p>
-    <w:p>
-      <w:pPr>
-        <w:spacing w:after="0" w:before="0" w:line="240" w:lineRule="auto"/>
-      </w:pPr>
-      <w:r>
-        <w:rPr>
-          <w:rFonts w:ascii="Consolas" w:cs="Consolas" w:eastAsia="Consolas" w:hAnsi="Consolas"/>
-          <w:sz w:val="20"/>
-          <w:szCs w:val="20"/>
-        </w:rPr>
         <w:t xml:space="preserve">        else:</w:t>
       </w:r>
     </w:p>
@@ -1594,19 +1321,6 @@
           <w:sz w:val="20"/>
           <w:szCs w:val="20"/>
         </w:rPr>
-        <w:t xml:space="preserve"/>
-      </w:r>
-    </w:p>
-    <w:p>
-      <w:pPr>
-        <w:spacing w:after="0" w:before="0" w:line="240" w:lineRule="auto"/>
-      </w:pPr>
-      <w:r>
-        <w:rPr>
-          <w:rFonts w:ascii="Consolas" w:cs="Consolas" w:eastAsia="Consolas" w:hAnsi="Consolas"/>
-          <w:sz w:val="20"/>
-          <w:szCs w:val="20"/>
-        </w:rPr>
         <w:t xml:space="preserve">    return total_value</w:t>
       </w:r>
     </w:p>
@@ -1620,19 +1334,6 @@
           <w:sz w:val="20"/>
           <w:szCs w:val="20"/>
         </w:rPr>
-        <w:t xml:space="preserve"/>
-      </w:r>
-    </w:p>
-    <w:p>
-      <w:pPr>
-        <w:spacing w:after="0" w:before="0" w:line="240" w:lineRule="auto"/>
-      </w:pPr>
-      <w:r>
-        <w:rPr>
-          <w:rFonts w:ascii="Consolas" w:cs="Consolas" w:eastAsia="Consolas" w:hAnsi="Consolas"/>
-          <w:sz w:val="20"/>
-          <w:szCs w:val="20"/>
-        </w:rPr>
         <w:t xml:space="preserve">weights = [10, 20, 30]</w:t>
       </w:r>
     </w:p>
@@ -1672,19 +1373,6 @@
           <w:sz w:val="20"/>
           <w:szCs w:val="20"/>
         </w:rPr>
-        <w:t xml:space="preserve"/>
-      </w:r>
-    </w:p>
-    <w:p>
-      <w:pPr>
-        <w:spacing w:after="0" w:before="0" w:line="240" w:lineRule="auto"/>
-      </w:pPr>
-      <w:r>
-        <w:rPr>
-          <w:rFonts w:ascii="Consolas" w:cs="Consolas" w:eastAsia="Consolas" w:hAnsi="Consolas"/>
-          <w:sz w:val="20"/>
-          <w:szCs w:val="20"/>
-        </w:rPr>
         <w:t xml:space="preserve">print("Maximum value:", fractional_knapsack(weights, values, capacity))</w:t>
       </w:r>
     </w:p>
@@ -1972,19 +1660,6 @@
           <w:sz w:val="20"/>
           <w:szCs w:val="20"/>
         </w:rPr>
-        <w:t xml:space="preserve"/>
-      </w:r>
-    </w:p>
-    <w:p>
-      <w:pPr>
-        <w:spacing w:after="0" w:before="0" w:line="240" w:lineRule="auto"/>
-      </w:pPr>
-      <w:r>
-        <w:rPr>
-          <w:rFonts w:ascii="Consolas" w:cs="Consolas" w:eastAsia="Consolas" w:hAnsi="Consolas"/>
-          <w:sz w:val="20"/>
-          <w:szCs w:val="20"/>
-        </w:rPr>
         <w:t xml:space="preserve">    a = np.array(a, dtype=float)</w:t>
       </w:r>
     </w:p>
@@ -2011,19 +1686,6 @@
           <w:sz w:val="20"/>
           <w:szCs w:val="20"/>
         </w:rPr>
-        <w:t xml:space="preserve"/>
-      </w:r>
-    </w:p>
-    <w:p>
-      <w:pPr>
-        <w:spacing w:after="0" w:before="0" w:line="240" w:lineRule="auto"/>
-      </w:pPr>
-      <w:r>
-        <w:rPr>
-          <w:rFonts w:ascii="Consolas" w:cs="Consolas" w:eastAsia="Consolas" w:hAnsi="Consolas"/>
-          <w:sz w:val="20"/>
-          <w:szCs w:val="20"/>
-        </w:rPr>
         <w:t xml:space="preserve">    for i in range(n):</w:t>
       </w:r>
     </w:p>
@@ -2037,19 +1699,6 @@
           <w:sz w:val="20"/>
           <w:szCs w:val="20"/>
         </w:rPr>
-        <w:t xml:space="preserve"/>
-      </w:r>
-    </w:p>
-    <w:p>
-      <w:pPr>
-        <w:spacing w:after="0" w:before="0" w:line="240" w:lineRule="auto"/>
-      </w:pPr>
-      <w:r>
-        <w:rPr>
-          <w:rFonts w:ascii="Consolas" w:cs="Consolas" w:eastAsia="Consolas" w:hAnsi="Consolas"/>
-          <w:sz w:val="20"/>
-          <w:szCs w:val="20"/>
-        </w:rPr>
         <w:t xml:space="preserve">        max_row = np.argmax(np.abs(a[i:, i])) + i</w:t>
       </w:r>
     </w:p>
@@ -2063,19 +1712,6 @@
           <w:sz w:val="20"/>
           <w:szCs w:val="20"/>
         </w:rPr>
-        <w:t xml:space="preserve"/>
-      </w:r>
-    </w:p>
-    <w:p>
-      <w:pPr>
-        <w:spacing w:after="0" w:before="0" w:line="240" w:lineRule="auto"/>
-      </w:pPr>
-      <w:r>
-        <w:rPr>
-          <w:rFonts w:ascii="Consolas" w:cs="Consolas" w:eastAsia="Consolas" w:hAnsi="Consolas"/>
-          <w:sz w:val="20"/>
-          <w:szCs w:val="20"/>
-        </w:rPr>
         <w:t xml:space="preserve">        a[[i, max_row]] = a[[max_row, i]]</w:t>
       </w:r>
     </w:p>
@@ -2089,19 +1725,6 @@
           <w:sz w:val="20"/>
           <w:szCs w:val="20"/>
         </w:rPr>
-        <w:t xml:space="preserve"/>
-      </w:r>
-    </w:p>
-    <w:p>
-      <w:pPr>
-        <w:spacing w:after="0" w:before="0" w:line="240" w:lineRule="auto"/>
-      </w:pPr>
-      <w:r>
-        <w:rPr>
-          <w:rFonts w:ascii="Consolas" w:cs="Consolas" w:eastAsia="Consolas" w:hAnsi="Consolas"/>
-          <w:sz w:val="20"/>
-          <w:szCs w:val="20"/>
-        </w:rPr>
         <w:t xml:space="preserve">        b[i], b[max_row] = b[max_row], b[i]</w:t>
       </w:r>
     </w:p>
@@ -2115,19 +1738,6 @@
           <w:sz w:val="20"/>
           <w:szCs w:val="20"/>
         </w:rPr>
-        <w:t xml:space="preserve"/>
-      </w:r>
-    </w:p>
-    <w:p>
-      <w:pPr>
-        <w:spacing w:after="0" w:before="0" w:line="240" w:lineRule="auto"/>
-      </w:pPr>
-      <w:r>
-        <w:rPr>
-          <w:rFonts w:ascii="Consolas" w:cs="Consolas" w:eastAsia="Consolas" w:hAnsi="Consolas"/>
-          <w:sz w:val="20"/>
-          <w:szCs w:val="20"/>
-        </w:rPr>
         <w:t xml:space="preserve">        for j in range(i + 1, n):</w:t>
       </w:r>
     </w:p>
@@ -2141,19 +1751,6 @@
           <w:sz w:val="20"/>
           <w:szCs w:val="20"/>
         </w:rPr>
-        <w:t xml:space="preserve"/>
-      </w:r>
-    </w:p>
-    <w:p>
-      <w:pPr>
-        <w:spacing w:after="0" w:before="0" w:line="240" w:lineRule="auto"/>
-      </w:pPr>
-      <w:r>
-        <w:rPr>
-          <w:rFonts w:ascii="Consolas" w:cs="Consolas" w:eastAsia="Consolas" w:hAnsi="Consolas"/>
-          <w:sz w:val="20"/>
-          <w:szCs w:val="20"/>
-        </w:rPr>
         <w:t xml:space="preserve">            factor = a[j][i] / a[i][i]</w:t>
       </w:r>
     </w:p>
@@ -2167,19 +1764,6 @@
           <w:sz w:val="20"/>
           <w:szCs w:val="20"/>
         </w:rPr>
-        <w:t xml:space="preserve"/>
-      </w:r>
-    </w:p>
-    <w:p>
-      <w:pPr>
-        <w:spacing w:after="0" w:before="0" w:line="240" w:lineRule="auto"/>
-      </w:pPr>
-      <w:r>
-        <w:rPr>
-          <w:rFonts w:ascii="Consolas" w:cs="Consolas" w:eastAsia="Consolas" w:hAnsi="Consolas"/>
-          <w:sz w:val="20"/>
-          <w:szCs w:val="20"/>
-        </w:rPr>
         <w:t xml:space="preserve">            a[j, i:] -= factor * a[i, i:]</w:t>
       </w:r>
     </w:p>
@@ -2193,19 +1777,6 @@
           <w:sz w:val="20"/>
           <w:szCs w:val="20"/>
         </w:rPr>
-        <w:t xml:space="preserve"/>
-      </w:r>
-    </w:p>
-    <w:p>
-      <w:pPr>
-        <w:spacing w:after="0" w:before="0" w:line="240" w:lineRule="auto"/>
-      </w:pPr>
-      <w:r>
-        <w:rPr>
-          <w:rFonts w:ascii="Consolas" w:cs="Consolas" w:eastAsia="Consolas" w:hAnsi="Consolas"/>
-          <w:sz w:val="20"/>
-          <w:szCs w:val="20"/>
-        </w:rPr>
         <w:t xml:space="preserve">            b[j] -= factor * b[i]</w:t>
       </w:r>
     </w:p>
@@ -2219,19 +1790,6 @@
           <w:sz w:val="20"/>
           <w:szCs w:val="20"/>
         </w:rPr>
-        <w:t xml:space="preserve"/>
-      </w:r>
-    </w:p>
-    <w:p>
-      <w:pPr>
-        <w:spacing w:after="0" w:before="0" w:line="240" w:lineRule="auto"/>
-      </w:pPr>
-      <w:r>
-        <w:rPr>
-          <w:rFonts w:ascii="Consolas" w:cs="Consolas" w:eastAsia="Consolas" w:hAnsi="Consolas"/>
-          <w:sz w:val="20"/>
-          <w:szCs w:val="20"/>
-        </w:rPr>
         <w:t xml:space="preserve">    x = np.zeros_like(b)</w:t>
       </w:r>
     </w:p>
@@ -2245,19 +1803,6 @@
           <w:sz w:val="20"/>
           <w:szCs w:val="20"/>
         </w:rPr>
-        <w:t xml:space="preserve"/>
-      </w:r>
-    </w:p>
-    <w:p>
-      <w:pPr>
-        <w:spacing w:after="0" w:before="0" w:line="240" w:lineRule="auto"/>
-      </w:pPr>
-      <w:r>
-        <w:rPr>
-          <w:rFonts w:ascii="Consolas" w:cs="Consolas" w:eastAsia="Consolas" w:hAnsi="Consolas"/>
-          <w:sz w:val="20"/>
-          <w:szCs w:val="20"/>
-        </w:rPr>
         <w:t xml:space="preserve">    for i in range(n - 1, -1, -1):</w:t>
       </w:r>
     </w:p>
@@ -2271,46 +1816,7 @@
           <w:sz w:val="20"/>
           <w:szCs w:val="20"/>
         </w:rPr>
-        <w:t xml:space="preserve"/>
-      </w:r>
-    </w:p>
-    <w:p>
-      <w:pPr>
-        <w:spacing w:after="0" w:before="0" w:line="240" w:lineRule="auto"/>
-      </w:pPr>
-      <w:r>
-        <w:rPr>
-          <w:rFonts w:ascii="Consolas" w:cs="Consolas" w:eastAsia="Consolas" w:hAnsi="Consolas"/>
-          <w:sz w:val="20"/>
-          <w:szCs w:val="20"/>
-        </w:rPr>
-        <w:t xml:space="preserve">        x[i] = (b[i] -</w:t>
-      </w:r>
-    </w:p>
-    <w:p>
-      <w:pPr>
-        <w:spacing w:after="0" w:before="0" w:line="240" w:lineRule="auto"/>
-      </w:pPr>
-      <w:r>
-        <w:rPr>
-          <w:rFonts w:ascii="Consolas" w:cs="Consolas" w:eastAsia="Consolas" w:hAnsi="Consolas"/>
-          <w:sz w:val="20"/>
-          <w:szCs w:val="20"/>
-        </w:rPr>
-        <w:t xml:space="preserve">                np.dot(a[i, i + 1:], x[i + 1:])) / a[i][i]</w:t>
-      </w:r>
-    </w:p>
-    <w:p>
-      <w:pPr>
-        <w:spacing w:after="0" w:before="0" w:line="240" w:lineRule="auto"/>
-      </w:pPr>
-      <w:r>
-        <w:rPr>
-          <w:rFonts w:ascii="Consolas" w:cs="Consolas" w:eastAsia="Consolas" w:hAnsi="Consolas"/>
-          <w:sz w:val="20"/>
-          <w:szCs w:val="20"/>
-        </w:rPr>
-        <w:t xml:space="preserve"/>
+        <w:t xml:space="preserve">        x[i] = (b[i] - np.dot(a[i, i + 1:], x[i + 1:])) / a[i][i]</w:t>
       </w:r>
     </w:p>
     <w:p>
@@ -2336,19 +1842,6 @@
           <w:sz w:val="20"/>
           <w:szCs w:val="20"/>
         </w:rPr>
-        <w:t xml:space="preserve"/>
-      </w:r>
-    </w:p>
-    <w:p>
-      <w:pPr>
-        <w:spacing w:after="0" w:before="0" w:line="240" w:lineRule="auto"/>
-      </w:pPr>
-      <w:r>
-        <w:rPr>
-          <w:rFonts w:ascii="Consolas" w:cs="Consolas" w:eastAsia="Consolas" w:hAnsi="Consolas"/>
-          <w:sz w:val="20"/>
-          <w:szCs w:val="20"/>
-        </w:rPr>
         <w:t xml:space="preserve">a = [</w:t>
       </w:r>
     </w:p>
@@ -2414,19 +1907,6 @@
           <w:sz w:val="20"/>
           <w:szCs w:val="20"/>
         </w:rPr>
-        <w:t xml:space="preserve"/>
-      </w:r>
-    </w:p>
-    <w:p>
-      <w:pPr>
-        <w:spacing w:after="0" w:before="0" w:line="240" w:lineRule="auto"/>
-      </w:pPr>
-      <w:r>
-        <w:rPr>
-          <w:rFonts w:ascii="Consolas" w:cs="Consolas" w:eastAsia="Consolas" w:hAnsi="Consolas"/>
-          <w:sz w:val="20"/>
-          <w:szCs w:val="20"/>
-        </w:rPr>
         <w:t xml:space="preserve">b = [8, -11, -3]</w:t>
       </w:r>
     </w:p>
@@ -2440,19 +1920,6 @@
           <w:sz w:val="20"/>
           <w:szCs w:val="20"/>
         </w:rPr>
-        <w:t xml:space="preserve"/>
-      </w:r>
-    </w:p>
-    <w:p>
-      <w:pPr>
-        <w:spacing w:after="0" w:before="0" w:line="240" w:lineRule="auto"/>
-      </w:pPr>
-      <w:r>
-        <w:rPr>
-          <w:rFonts w:ascii="Consolas" w:cs="Consolas" w:eastAsia="Consolas" w:hAnsi="Consolas"/>
-          <w:sz w:val="20"/>
-          <w:szCs w:val="20"/>
-        </w:rPr>
         <w:t xml:space="preserve">solution = gaussian_elimination(a, b)</w:t>
       </w:r>
     </w:p>
@@ -2466,19 +1933,6 @@
           <w:sz w:val="20"/>
           <w:szCs w:val="20"/>
         </w:rPr>
-        <w:t xml:space="preserve"/>
-      </w:r>
-    </w:p>
-    <w:p>
-      <w:pPr>
-        <w:spacing w:after="0" w:before="0" w:line="240" w:lineRule="auto"/>
-      </w:pPr>
-      <w:r>
-        <w:rPr>
-          <w:rFonts w:ascii="Consolas" w:cs="Consolas" w:eastAsia="Consolas" w:hAnsi="Consolas"/>
-          <w:sz w:val="20"/>
-          <w:szCs w:val="20"/>
-        </w:rPr>
         <w:t xml:space="preserve">print("Solution:", solution)</w:t>
       </w:r>
     </w:p>
@@ -2792,19 +2246,6 @@
           <w:sz w:val="20"/>
           <w:szCs w:val="20"/>
         </w:rPr>
-        <w:t xml:space="preserve"/>
-      </w:r>
-    </w:p>
-    <w:p>
-      <w:pPr>
-        <w:spacing w:after="0" w:before="0" w:line="240" w:lineRule="auto"/>
-      </w:pPr>
-      <w:r>
-        <w:rPr>
-          <w:rFonts w:ascii="Consolas" w:cs="Consolas" w:eastAsia="Consolas" w:hAnsi="Consolas"/>
-          <w:sz w:val="20"/>
-          <w:szCs w:val="20"/>
-        </w:rPr>
         <w:t xml:space="preserve">    for i in range(n):</w:t>
       </w:r>
     </w:p>
@@ -2883,19 +2324,6 @@
           <w:sz w:val="20"/>
           <w:szCs w:val="20"/>
         </w:rPr>
-        <w:t xml:space="preserve"/>
-      </w:r>
-    </w:p>
-    <w:p>
-      <w:pPr>
-        <w:spacing w:after="0" w:before="0" w:line="240" w:lineRule="auto"/>
-      </w:pPr>
-      <w:r>
-        <w:rPr>
-          <w:rFonts w:ascii="Consolas" w:cs="Consolas" w:eastAsia="Consolas" w:hAnsi="Consolas"/>
-          <w:sz w:val="20"/>
-          <w:szCs w:val="20"/>
-        </w:rPr>
         <w:t xml:space="preserve">    return L, U</w:t>
       </w:r>
     </w:p>
@@ -2909,19 +2337,6 @@
           <w:sz w:val="20"/>
           <w:szCs w:val="20"/>
         </w:rPr>
-        <w:t xml:space="preserve"/>
-      </w:r>
-    </w:p>
-    <w:p>
-      <w:pPr>
-        <w:spacing w:after="0" w:before="0" w:line="240" w:lineRule="auto"/>
-      </w:pPr>
-      <w:r>
-        <w:rPr>
-          <w:rFonts w:ascii="Consolas" w:cs="Consolas" w:eastAsia="Consolas" w:hAnsi="Consolas"/>
-          <w:sz w:val="20"/>
-          <w:szCs w:val="20"/>
-        </w:rPr>
         <w:t xml:space="preserve">A = np.array([[4, 3], [6, 3]])</w:t>
       </w:r>
     </w:p>
@@ -3287,19 +2702,6 @@
           <w:sz w:val="20"/>
           <w:szCs w:val="20"/>
         </w:rPr>
-        <w:t xml:space="preserve"/>
-      </w:r>
-    </w:p>
-    <w:p>
-      <w:pPr>
-        <w:spacing w:after="0" w:before="0" w:line="240" w:lineRule="auto"/>
-      </w:pPr>
-      <w:r>
-        <w:rPr>
-          <w:rFonts w:ascii="Consolas" w:cs="Consolas" w:eastAsia="Consolas" w:hAnsi="Consolas"/>
-          <w:sz w:val="20"/>
-          <w:szCs w:val="20"/>
-        </w:rPr>
         <w:t xml:space="preserve">    for k in range(n):</w:t>
       </w:r>
     </w:p>
@@ -3352,19 +2754,6 @@
           <w:sz w:val="20"/>
           <w:szCs w:val="20"/>
         </w:rPr>
-        <w:t xml:space="preserve"/>
-      </w:r>
-    </w:p>
-    <w:p>
-      <w:pPr>
-        <w:spacing w:after="0" w:before="0" w:line="240" w:lineRule="auto"/>
-      </w:pPr>
-      <w:r>
-        <w:rPr>
-          <w:rFonts w:ascii="Consolas" w:cs="Consolas" w:eastAsia="Consolas" w:hAnsi="Consolas"/>
-          <w:sz w:val="20"/>
-          <w:szCs w:val="20"/>
-        </w:rPr>
         <w:t xml:space="preserve">    return reach</w:t>
       </w:r>
     </w:p>
@@ -3378,19 +2767,6 @@
           <w:sz w:val="20"/>
           <w:szCs w:val="20"/>
         </w:rPr>
-        <w:t xml:space="preserve"/>
-      </w:r>
-    </w:p>
-    <w:p>
-      <w:pPr>
-        <w:spacing w:after="0" w:before="0" w:line="240" w:lineRule="auto"/>
-      </w:pPr>
-      <w:r>
-        <w:rPr>
-          <w:rFonts w:ascii="Consolas" w:cs="Consolas" w:eastAsia="Consolas" w:hAnsi="Consolas"/>
-          <w:sz w:val="20"/>
-          <w:szCs w:val="20"/>
-        </w:rPr>
         <w:t xml:space="preserve">graph = [</w:t>
       </w:r>
     </w:p>
@@ -3456,19 +2832,6 @@
           <w:sz w:val="20"/>
           <w:szCs w:val="20"/>
         </w:rPr>
-        <w:t xml:space="preserve"/>
-      </w:r>
-    </w:p>
-    <w:p>
-      <w:pPr>
-        <w:spacing w:after="0" w:before="0" w:line="240" w:lineRule="auto"/>
-      </w:pPr>
-      <w:r>
-        <w:rPr>
-          <w:rFonts w:ascii="Consolas" w:cs="Consolas" w:eastAsia="Consolas" w:hAnsi="Consolas"/>
-          <w:sz w:val="20"/>
-          <w:szCs w:val="20"/>
-        </w:rPr>
         <w:t xml:space="preserve">transitive_closure = warshall_algorithm(graph)</w:t>
       </w:r>
     </w:p>
@@ -3743,19 +3106,6 @@
           <w:sz w:val="20"/>
           <w:szCs w:val="20"/>
         </w:rPr>
-        <w:t xml:space="preserve"/>
-      </w:r>
-    </w:p>
-    <w:p>
-      <w:pPr>
-        <w:spacing w:after="0" w:before="0" w:line="240" w:lineRule="auto"/>
-      </w:pPr>
-      <w:r>
-        <w:rPr>
-          <w:rFonts w:ascii="Consolas" w:cs="Consolas" w:eastAsia="Consolas" w:hAnsi="Consolas"/>
-          <w:sz w:val="20"/>
-          <w:szCs w:val="20"/>
-        </w:rPr>
         <w:t xml:space="preserve">    d = 256</w:t>
       </w:r>
     </w:p>
@@ -3782,19 +3132,6 @@
           <w:sz w:val="20"/>
           <w:szCs w:val="20"/>
         </w:rPr>
-        <w:t xml:space="preserve"/>
-      </w:r>
-    </w:p>
-    <w:p>
-      <w:pPr>
-        <w:spacing w:after="0" w:before="0" w:line="240" w:lineRule="auto"/>
-      </w:pPr>
-      <w:r>
-        <w:rPr>
-          <w:rFonts w:ascii="Consolas" w:cs="Consolas" w:eastAsia="Consolas" w:hAnsi="Consolas"/>
-          <w:sz w:val="20"/>
-          <w:szCs w:val="20"/>
-        </w:rPr>
         <w:t xml:space="preserve">    m = len(pattern)</w:t>
       </w:r>
     </w:p>
@@ -3821,19 +3158,6 @@
           <w:sz w:val="20"/>
           <w:szCs w:val="20"/>
         </w:rPr>
-        <w:t xml:space="preserve"/>
-      </w:r>
-    </w:p>
-    <w:p>
-      <w:pPr>
-        <w:spacing w:after="0" w:before="0" w:line="240" w:lineRule="auto"/>
-      </w:pPr>
-      <w:r>
-        <w:rPr>
-          <w:rFonts w:ascii="Consolas" w:cs="Consolas" w:eastAsia="Consolas" w:hAnsi="Consolas"/>
-          <w:sz w:val="20"/>
-          <w:szCs w:val="20"/>
-        </w:rPr>
         <w:t xml:space="preserve">    h_pattern = 0</w:t>
       </w:r>
     </w:p>
@@ -3873,19 +3197,6 @@
           <w:sz w:val="20"/>
           <w:szCs w:val="20"/>
         </w:rPr>
-        <w:t xml:space="preserve"/>
-      </w:r>
-    </w:p>
-    <w:p>
-      <w:pPr>
-        <w:spacing w:after="0" w:before="0" w:line="240" w:lineRule="auto"/>
-      </w:pPr>
-      <w:r>
-        <w:rPr>
-          <w:rFonts w:ascii="Consolas" w:cs="Consolas" w:eastAsia="Consolas" w:hAnsi="Consolas"/>
-          <w:sz w:val="20"/>
-          <w:szCs w:val="20"/>
-        </w:rPr>
         <w:t xml:space="preserve">    for i in range(m - 1):</w:t>
       </w:r>
     </w:p>
@@ -3912,19 +3223,6 @@
           <w:sz w:val="20"/>
           <w:szCs w:val="20"/>
         </w:rPr>
-        <w:t xml:space="preserve"/>
-      </w:r>
-    </w:p>
-    <w:p>
-      <w:pPr>
-        <w:spacing w:after="0" w:before="0" w:line="240" w:lineRule="auto"/>
-      </w:pPr>
-      <w:r>
-        <w:rPr>
-          <w:rFonts w:ascii="Consolas" w:cs="Consolas" w:eastAsia="Consolas" w:hAnsi="Consolas"/>
-          <w:sz w:val="20"/>
-          <w:szCs w:val="20"/>
-        </w:rPr>
         <w:t xml:space="preserve">    for i in range(m):</w:t>
       </w:r>
     </w:p>
@@ -3938,19 +3236,6 @@
           <w:sz w:val="20"/>
           <w:szCs w:val="20"/>
         </w:rPr>
-        <w:t xml:space="preserve"/>
-      </w:r>
-    </w:p>
-    <w:p>
-      <w:pPr>
-        <w:spacing w:after="0" w:before="0" w:line="240" w:lineRule="auto"/>
-      </w:pPr>
-      <w:r>
-        <w:rPr>
-          <w:rFonts w:ascii="Consolas" w:cs="Consolas" w:eastAsia="Consolas" w:hAnsi="Consolas"/>
-          <w:sz w:val="20"/>
-          <w:szCs w:val="20"/>
-        </w:rPr>
         <w:t xml:space="preserve">        h_pattern = (d * h_pattern + ord(pattern[i])) % q</w:t>
       </w:r>
     </w:p>
@@ -3964,19 +3249,6 @@
           <w:sz w:val="20"/>
           <w:szCs w:val="20"/>
         </w:rPr>
-        <w:t xml:space="preserve"/>
-      </w:r>
-    </w:p>
-    <w:p>
-      <w:pPr>
-        <w:spacing w:after="0" w:before="0" w:line="240" w:lineRule="auto"/>
-      </w:pPr>
-      <w:r>
-        <w:rPr>
-          <w:rFonts w:ascii="Consolas" w:cs="Consolas" w:eastAsia="Consolas" w:hAnsi="Consolas"/>
-          <w:sz w:val="20"/>
-          <w:szCs w:val="20"/>
-        </w:rPr>
         <w:t xml:space="preserve">        h_text = (d * h_text + ord(text[i])) % q</w:t>
       </w:r>
     </w:p>
@@ -3990,19 +3262,6 @@
           <w:sz w:val="20"/>
           <w:szCs w:val="20"/>
         </w:rPr>
-        <w:t xml:space="preserve"/>
-      </w:r>
-    </w:p>
-    <w:p>
-      <w:pPr>
-        <w:spacing w:after="0" w:before="0" w:line="240" w:lineRule="auto"/>
-      </w:pPr>
-      <w:r>
-        <w:rPr>
-          <w:rFonts w:ascii="Consolas" w:cs="Consolas" w:eastAsia="Consolas" w:hAnsi="Consolas"/>
-          <w:sz w:val="20"/>
-          <w:szCs w:val="20"/>
-        </w:rPr>
         <w:t xml:space="preserve">    for i in range(n - m + 1):</w:t>
       </w:r>
     </w:p>
@@ -4016,19 +3275,6 @@
           <w:sz w:val="20"/>
           <w:szCs w:val="20"/>
         </w:rPr>
-        <w:t xml:space="preserve"/>
-      </w:r>
-    </w:p>
-    <w:p>
-      <w:pPr>
-        <w:spacing w:after="0" w:before="0" w:line="240" w:lineRule="auto"/>
-      </w:pPr>
-      <w:r>
-        <w:rPr>
-          <w:rFonts w:ascii="Consolas" w:cs="Consolas" w:eastAsia="Consolas" w:hAnsi="Consolas"/>
-          <w:sz w:val="20"/>
-          <w:szCs w:val="20"/>
-        </w:rPr>
         <w:t xml:space="preserve">        if h_pattern == h_text:</w:t>
       </w:r>
     </w:p>
@@ -4042,19 +3288,6 @@
           <w:sz w:val="20"/>
           <w:szCs w:val="20"/>
         </w:rPr>
-        <w:t xml:space="preserve"/>
-      </w:r>
-    </w:p>
-    <w:p>
-      <w:pPr>
-        <w:spacing w:after="0" w:before="0" w:line="240" w:lineRule="auto"/>
-      </w:pPr>
-      <w:r>
-        <w:rPr>
-          <w:rFonts w:ascii="Consolas" w:cs="Consolas" w:eastAsia="Consolas" w:hAnsi="Consolas"/>
-          <w:sz w:val="20"/>
-          <w:szCs w:val="20"/>
-        </w:rPr>
         <w:t xml:space="preserve">            if text[i:i + m] == pattern:</w:t>
       </w:r>
     </w:p>
@@ -4068,19 +3301,6 @@
           <w:sz w:val="20"/>
           <w:szCs w:val="20"/>
         </w:rPr>
-        <w:t xml:space="preserve"/>
-      </w:r>
-    </w:p>
-    <w:p>
-      <w:pPr>
-        <w:spacing w:after="0" w:before="0" w:line="240" w:lineRule="auto"/>
-      </w:pPr>
-      <w:r>
-        <w:rPr>
-          <w:rFonts w:ascii="Consolas" w:cs="Consolas" w:eastAsia="Consolas" w:hAnsi="Consolas"/>
-          <w:sz w:val="20"/>
-          <w:szCs w:val="20"/>
-        </w:rPr>
         <w:t xml:space="preserve">                return i</w:t>
       </w:r>
     </w:p>
@@ -4094,19 +3314,6 @@
           <w:sz w:val="20"/>
           <w:szCs w:val="20"/>
         </w:rPr>
-        <w:t xml:space="preserve"/>
-      </w:r>
-    </w:p>
-    <w:p>
-      <w:pPr>
-        <w:spacing w:after="0" w:before="0" w:line="240" w:lineRule="auto"/>
-      </w:pPr>
-      <w:r>
-        <w:rPr>
-          <w:rFonts w:ascii="Consolas" w:cs="Consolas" w:eastAsia="Consolas" w:hAnsi="Consolas"/>
-          <w:sz w:val="20"/>
-          <w:szCs w:val="20"/>
-        </w:rPr>
         <w:t xml:space="preserve">        if i &lt; n - m:</w:t>
       </w:r>
     </w:p>
@@ -4120,72 +3327,7 @@
           <w:sz w:val="20"/>
           <w:szCs w:val="20"/>
         </w:rPr>
-        <w:t xml:space="preserve"/>
-      </w:r>
-    </w:p>
-    <w:p>
-      <w:pPr>
-        <w:spacing w:after="0" w:before="0" w:line="240" w:lineRule="auto"/>
-      </w:pPr>
-      <w:r>
-        <w:rPr>
-          <w:rFonts w:ascii="Consolas" w:cs="Consolas" w:eastAsia="Consolas" w:hAnsi="Consolas"/>
-          <w:sz w:val="20"/>
-          <w:szCs w:val="20"/>
-        </w:rPr>
-        <w:t xml:space="preserve">            h_text = (</w:t>
-      </w:r>
-    </w:p>
-    <w:p>
-      <w:pPr>
-        <w:spacing w:after="0" w:before="0" w:line="240" w:lineRule="auto"/>
-      </w:pPr>
-      <w:r>
-        <w:rPr>
-          <w:rFonts w:ascii="Consolas" w:cs="Consolas" w:eastAsia="Consolas" w:hAnsi="Consolas"/>
-          <w:sz w:val="20"/>
-          <w:szCs w:val="20"/>
-        </w:rPr>
-        <w:t xml:space="preserve">                d * (h_text - ord(text[i]) * h)</w:t>
-      </w:r>
-    </w:p>
-    <w:p>
-      <w:pPr>
-        <w:spacing w:after="0" w:before="0" w:line="240" w:lineRule="auto"/>
-      </w:pPr>
-      <w:r>
-        <w:rPr>
-          <w:rFonts w:ascii="Consolas" w:cs="Consolas" w:eastAsia="Consolas" w:hAnsi="Consolas"/>
-          <w:sz w:val="20"/>
-          <w:szCs w:val="20"/>
-        </w:rPr>
-        <w:t xml:space="preserve">                + ord(text[i + m])</w:t>
-      </w:r>
-    </w:p>
-    <w:p>
-      <w:pPr>
-        <w:spacing w:after="0" w:before="0" w:line="240" w:lineRule="auto"/>
-      </w:pPr>
-      <w:r>
-        <w:rPr>
-          <w:rFonts w:ascii="Consolas" w:cs="Consolas" w:eastAsia="Consolas" w:hAnsi="Consolas"/>
-          <w:sz w:val="20"/>
-          <w:szCs w:val="20"/>
-        </w:rPr>
-        <w:t xml:space="preserve">            ) % q</w:t>
-      </w:r>
-    </w:p>
-    <w:p>
-      <w:pPr>
-        <w:spacing w:after="0" w:before="0" w:line="240" w:lineRule="auto"/>
-      </w:pPr>
-      <w:r>
-        <w:rPr>
-          <w:rFonts w:ascii="Consolas" w:cs="Consolas" w:eastAsia="Consolas" w:hAnsi="Consolas"/>
-          <w:sz w:val="20"/>
-          <w:szCs w:val="20"/>
-        </w:rPr>
-        <w:t xml:space="preserve"/>
+        <w:t xml:space="preserve">            h_text = ( d * (h_text - ord(text[i]) * h) + ord(text[i + m]) ) % q</w:t>
       </w:r>
     </w:p>
     <w:p>
@@ -4211,19 +3353,6 @@
           <w:sz w:val="20"/>
           <w:szCs w:val="20"/>
         </w:rPr>
-        <w:t xml:space="preserve"/>
-      </w:r>
-    </w:p>
-    <w:p>
-      <w:pPr>
-        <w:spacing w:after="0" w:before="0" w:line="240" w:lineRule="auto"/>
-      </w:pPr>
-      <w:r>
-        <w:rPr>
-          <w:rFonts w:ascii="Consolas" w:cs="Consolas" w:eastAsia="Consolas" w:hAnsi="Consolas"/>
-          <w:sz w:val="20"/>
-          <w:szCs w:val="20"/>
-        </w:rPr>
         <w:t xml:space="preserve">                h_text += q</w:t>
       </w:r>
     </w:p>
@@ -4237,19 +3366,6 @@
           <w:sz w:val="20"/>
           <w:szCs w:val="20"/>
         </w:rPr>
-        <w:t xml:space="preserve"/>
-      </w:r>
-    </w:p>
-    <w:p>
-      <w:pPr>
-        <w:spacing w:after="0" w:before="0" w:line="240" w:lineRule="auto"/>
-      </w:pPr>
-      <w:r>
-        <w:rPr>
-          <w:rFonts w:ascii="Consolas" w:cs="Consolas" w:eastAsia="Consolas" w:hAnsi="Consolas"/>
-          <w:sz w:val="20"/>
-          <w:szCs w:val="20"/>
-        </w:rPr>
         <w:t xml:space="preserve">    return -1</w:t>
       </w:r>
     </w:p>
@@ -4263,19 +3379,6 @@
           <w:sz w:val="20"/>
           <w:szCs w:val="20"/>
         </w:rPr>
-        <w:t xml:space="preserve"/>
-      </w:r>
-    </w:p>
-    <w:p>
-      <w:pPr>
-        <w:spacing w:after="0" w:before="0" w:line="240" w:lineRule="auto"/>
-      </w:pPr>
-      <w:r>
-        <w:rPr>
-          <w:rFonts w:ascii="Consolas" w:cs="Consolas" w:eastAsia="Consolas" w:hAnsi="Consolas"/>
-          <w:sz w:val="20"/>
-          <w:szCs w:val="20"/>
-        </w:rPr>
         <w:t xml:space="preserve">text = "ABABDABACDABABCABAB"</w:t>
       </w:r>
     </w:p>
@@ -4289,19 +3392,6 @@
           <w:sz w:val="20"/>
           <w:szCs w:val="20"/>
         </w:rPr>
-        <w:t xml:space="preserve"/>
-      </w:r>
-    </w:p>
-    <w:p>
-      <w:pPr>
-        <w:spacing w:after="0" w:before="0" w:line="240" w:lineRule="auto"/>
-      </w:pPr>
-      <w:r>
-        <w:rPr>
-          <w:rFonts w:ascii="Consolas" w:cs="Consolas" w:eastAsia="Consolas" w:hAnsi="Consolas"/>
-          <w:sz w:val="20"/>
-          <w:szCs w:val="20"/>
-        </w:rPr>
         <w:t xml:space="preserve">pattern = "ABABCABAB"</w:t>
       </w:r>
     </w:p>
@@ -4315,33 +3405,7 @@
           <w:sz w:val="20"/>
           <w:szCs w:val="20"/>
         </w:rPr>
-        <w:t xml:space="preserve"/>
-      </w:r>
-    </w:p>
-    <w:p>
-      <w:pPr>
-        <w:spacing w:after="0" w:before="0" w:line="240" w:lineRule="auto"/>
-      </w:pPr>
-      <w:r>
-        <w:rPr>
-          <w:rFonts w:ascii="Consolas" w:cs="Consolas" w:eastAsia="Consolas" w:hAnsi="Consolas"/>
-          <w:sz w:val="20"/>
-          <w:szCs w:val="20"/>
-        </w:rPr>
-        <w:t xml:space="preserve">print("Pattern found at index:",</w:t>
-      </w:r>
-    </w:p>
-    <w:p>
-      <w:pPr>
-        <w:spacing w:after="0" w:before="0" w:line="240" w:lineRule="auto"/>
-      </w:pPr>
-      <w:r>
-        <w:rPr>
-          <w:rFonts w:ascii="Consolas" w:cs="Consolas" w:eastAsia="Consolas" w:hAnsi="Consolas"/>
-          <w:sz w:val="20"/>
-          <w:szCs w:val="20"/>
-        </w:rPr>
-        <w:t xml:space="preserve">      rabin_karp(text, pattern))</w:t>
+        <w:t xml:space="preserve">print("Pattern found at index:", rabin_karp(text, pattern))</w:t>
       </w:r>
     </w:p>
     <w:p>
@@ -4602,19 +3666,6 @@
           <w:sz w:val="20"/>
           <w:szCs w:val="20"/>
         </w:rPr>
-        <w:t xml:space="preserve"/>
-      </w:r>
-    </w:p>
-    <w:p>
-      <w:pPr>
-        <w:spacing w:after="0" w:before="0" w:line="240" w:lineRule="auto"/>
-      </w:pPr>
-      <w:r>
-        <w:rPr>
-          <w:rFonts w:ascii="Consolas" w:cs="Consolas" w:eastAsia="Consolas" w:hAnsi="Consolas"/>
-          <w:sz w:val="20"/>
-          <w:szCs w:val="20"/>
-        </w:rPr>
         <w:t xml:space="preserve">    def lps_array(pattern):</w:t>
       </w:r>
     </w:p>
@@ -4628,19 +3679,6 @@
           <w:sz w:val="20"/>
           <w:szCs w:val="20"/>
         </w:rPr>
-        <w:t xml:space="preserve"/>
-      </w:r>
-    </w:p>
-    <w:p>
-      <w:pPr>
-        <w:spacing w:after="0" w:before="0" w:line="240" w:lineRule="auto"/>
-      </w:pPr>
-      <w:r>
-        <w:rPr>
-          <w:rFonts w:ascii="Consolas" w:cs="Consolas" w:eastAsia="Consolas" w:hAnsi="Consolas"/>
-          <w:sz w:val="20"/>
-          <w:szCs w:val="20"/>
-        </w:rPr>
         <w:t xml:space="preserve">        lps = [0] * len(pattern)</w:t>
       </w:r>
     </w:p>
@@ -4654,19 +3692,6 @@
           <w:sz w:val="20"/>
           <w:szCs w:val="20"/>
         </w:rPr>
-        <w:t xml:space="preserve"/>
-      </w:r>
-    </w:p>
-    <w:p>
-      <w:pPr>
-        <w:spacing w:after="0" w:before="0" w:line="240" w:lineRule="auto"/>
-      </w:pPr>
-      <w:r>
-        <w:rPr>
-          <w:rFonts w:ascii="Consolas" w:cs="Consolas" w:eastAsia="Consolas" w:hAnsi="Consolas"/>
-          <w:sz w:val="20"/>
-          <w:szCs w:val="20"/>
-        </w:rPr>
         <w:t xml:space="preserve">        j = 0</w:t>
       </w:r>
     </w:p>
@@ -4680,19 +3705,6 @@
           <w:sz w:val="20"/>
           <w:szCs w:val="20"/>
         </w:rPr>
-        <w:t xml:space="preserve"/>
-      </w:r>
-    </w:p>
-    <w:p>
-      <w:pPr>
-        <w:spacing w:after="0" w:before="0" w:line="240" w:lineRule="auto"/>
-      </w:pPr>
-      <w:r>
-        <w:rPr>
-          <w:rFonts w:ascii="Consolas" w:cs="Consolas" w:eastAsia="Consolas" w:hAnsi="Consolas"/>
-          <w:sz w:val="20"/>
-          <w:szCs w:val="20"/>
-        </w:rPr>
         <w:t xml:space="preserve">        for i in range(1, len(pattern)):</w:t>
       </w:r>
     </w:p>
@@ -4706,19 +3718,6 @@
           <w:sz w:val="20"/>
           <w:szCs w:val="20"/>
         </w:rPr>
-        <w:t xml:space="preserve"/>
-      </w:r>
-    </w:p>
-    <w:p>
-      <w:pPr>
-        <w:spacing w:after="0" w:before="0" w:line="240" w:lineRule="auto"/>
-      </w:pPr>
-      <w:r>
-        <w:rPr>
-          <w:rFonts w:ascii="Consolas" w:cs="Consolas" w:eastAsia="Consolas" w:hAnsi="Consolas"/>
-          <w:sz w:val="20"/>
-          <w:szCs w:val="20"/>
-        </w:rPr>
         <w:t xml:space="preserve">            while j &gt; 0 and pattern[i] != pattern[j]:</w:t>
       </w:r>
     </w:p>
@@ -4732,19 +3731,6 @@
           <w:sz w:val="20"/>
           <w:szCs w:val="20"/>
         </w:rPr>
-        <w:t xml:space="preserve"/>
-      </w:r>
-    </w:p>
-    <w:p>
-      <w:pPr>
-        <w:spacing w:after="0" w:before="0" w:line="240" w:lineRule="auto"/>
-      </w:pPr>
-      <w:r>
-        <w:rPr>
-          <w:rFonts w:ascii="Consolas" w:cs="Consolas" w:eastAsia="Consolas" w:hAnsi="Consolas"/>
-          <w:sz w:val="20"/>
-          <w:szCs w:val="20"/>
-        </w:rPr>
         <w:t xml:space="preserve">                j = lps[j - 1]</w:t>
       </w:r>
     </w:p>
@@ -4758,19 +3744,6 @@
           <w:sz w:val="20"/>
           <w:szCs w:val="20"/>
         </w:rPr>
-        <w:t xml:space="preserve"/>
-      </w:r>
-    </w:p>
-    <w:p>
-      <w:pPr>
-        <w:spacing w:after="0" w:before="0" w:line="240" w:lineRule="auto"/>
-      </w:pPr>
-      <w:r>
-        <w:rPr>
-          <w:rFonts w:ascii="Consolas" w:cs="Consolas" w:eastAsia="Consolas" w:hAnsi="Consolas"/>
-          <w:sz w:val="20"/>
-          <w:szCs w:val="20"/>
-        </w:rPr>
         <w:t xml:space="preserve">            if pattern[i] == pattern[j]:</w:t>
       </w:r>
     </w:p>
@@ -4784,19 +3757,6 @@
           <w:sz w:val="20"/>
           <w:szCs w:val="20"/>
         </w:rPr>
-        <w:t xml:space="preserve"/>
-      </w:r>
-    </w:p>
-    <w:p>
-      <w:pPr>
-        <w:spacing w:after="0" w:before="0" w:line="240" w:lineRule="auto"/>
-      </w:pPr>
-      <w:r>
-        <w:rPr>
-          <w:rFonts w:ascii="Consolas" w:cs="Consolas" w:eastAsia="Consolas" w:hAnsi="Consolas"/>
-          <w:sz w:val="20"/>
-          <w:szCs w:val="20"/>
-        </w:rPr>
         <w:t xml:space="preserve">                j += 1</w:t>
       </w:r>
     </w:p>
@@ -4810,19 +3770,6 @@
           <w:sz w:val="20"/>
           <w:szCs w:val="20"/>
         </w:rPr>
-        <w:t xml:space="preserve"/>
-      </w:r>
-    </w:p>
-    <w:p>
-      <w:pPr>
-        <w:spacing w:after="0" w:before="0" w:line="240" w:lineRule="auto"/>
-      </w:pPr>
-      <w:r>
-        <w:rPr>
-          <w:rFonts w:ascii="Consolas" w:cs="Consolas" w:eastAsia="Consolas" w:hAnsi="Consolas"/>
-          <w:sz w:val="20"/>
-          <w:szCs w:val="20"/>
-        </w:rPr>
         <w:t xml:space="preserve">                lps[i] = j</w:t>
       </w:r>
     </w:p>
@@ -4836,19 +3783,6 @@
           <w:sz w:val="20"/>
           <w:szCs w:val="20"/>
         </w:rPr>
-        <w:t xml:space="preserve"/>
-      </w:r>
-    </w:p>
-    <w:p>
-      <w:pPr>
-        <w:spacing w:after="0" w:before="0" w:line="240" w:lineRule="auto"/>
-      </w:pPr>
-      <w:r>
-        <w:rPr>
-          <w:rFonts w:ascii="Consolas" w:cs="Consolas" w:eastAsia="Consolas" w:hAnsi="Consolas"/>
-          <w:sz w:val="20"/>
-          <w:szCs w:val="20"/>
-        </w:rPr>
         <w:t xml:space="preserve">        return lps</w:t>
       </w:r>
     </w:p>
@@ -4862,19 +3796,6 @@
           <w:sz w:val="20"/>
           <w:szCs w:val="20"/>
         </w:rPr>
-        <w:t xml:space="preserve"/>
-      </w:r>
-    </w:p>
-    <w:p>
-      <w:pPr>
-        <w:spacing w:after="0" w:before="0" w:line="240" w:lineRule="auto"/>
-      </w:pPr>
-      <w:r>
-        <w:rPr>
-          <w:rFonts w:ascii="Consolas" w:cs="Consolas" w:eastAsia="Consolas" w:hAnsi="Consolas"/>
-          <w:sz w:val="20"/>
-          <w:szCs w:val="20"/>
-        </w:rPr>
         <w:t xml:space="preserve">    lps = lps_array(pattern)</w:t>
       </w:r>
     </w:p>
@@ -4888,19 +3809,6 @@
           <w:sz w:val="20"/>
           <w:szCs w:val="20"/>
         </w:rPr>
-        <w:t xml:space="preserve"/>
-      </w:r>
-    </w:p>
-    <w:p>
-      <w:pPr>
-        <w:spacing w:after="0" w:before="0" w:line="240" w:lineRule="auto"/>
-      </w:pPr>
-      <w:r>
-        <w:rPr>
-          <w:rFonts w:ascii="Consolas" w:cs="Consolas" w:eastAsia="Consolas" w:hAnsi="Consolas"/>
-          <w:sz w:val="20"/>
-          <w:szCs w:val="20"/>
-        </w:rPr>
         <w:t xml:space="preserve">    i = 0</w:t>
       </w:r>
     </w:p>
@@ -4914,19 +3822,6 @@
           <w:sz w:val="20"/>
           <w:szCs w:val="20"/>
         </w:rPr>
-        <w:t xml:space="preserve"/>
-      </w:r>
-    </w:p>
-    <w:p>
-      <w:pPr>
-        <w:spacing w:after="0" w:before="0" w:line="240" w:lineRule="auto"/>
-      </w:pPr>
-      <w:r>
-        <w:rPr>
-          <w:rFonts w:ascii="Consolas" w:cs="Consolas" w:eastAsia="Consolas" w:hAnsi="Consolas"/>
-          <w:sz w:val="20"/>
-          <w:szCs w:val="20"/>
-        </w:rPr>
         <w:t xml:space="preserve">    j = 0</w:t>
       </w:r>
     </w:p>
@@ -4940,19 +3835,6 @@
           <w:sz w:val="20"/>
           <w:szCs w:val="20"/>
         </w:rPr>
-        <w:t xml:space="preserve"/>
-      </w:r>
-    </w:p>
-    <w:p>
-      <w:pPr>
-        <w:spacing w:after="0" w:before="0" w:line="240" w:lineRule="auto"/>
-      </w:pPr>
-      <w:r>
-        <w:rPr>
-          <w:rFonts w:ascii="Consolas" w:cs="Consolas" w:eastAsia="Consolas" w:hAnsi="Consolas"/>
-          <w:sz w:val="20"/>
-          <w:szCs w:val="20"/>
-        </w:rPr>
         <w:t xml:space="preserve">    while i &lt; len(text):</w:t>
       </w:r>
     </w:p>
@@ -4966,19 +3848,6 @@
           <w:sz w:val="20"/>
           <w:szCs w:val="20"/>
         </w:rPr>
-        <w:t xml:space="preserve"/>
-      </w:r>
-    </w:p>
-    <w:p>
-      <w:pPr>
-        <w:spacing w:after="0" w:before="0" w:line="240" w:lineRule="auto"/>
-      </w:pPr>
-      <w:r>
-        <w:rPr>
-          <w:rFonts w:ascii="Consolas" w:cs="Consolas" w:eastAsia="Consolas" w:hAnsi="Consolas"/>
-          <w:sz w:val="20"/>
-          <w:szCs w:val="20"/>
-        </w:rPr>
         <w:t xml:space="preserve">        if text[i] == pattern[j]:</w:t>
       </w:r>
     </w:p>
@@ -4992,19 +3861,6 @@
           <w:sz w:val="20"/>
           <w:szCs w:val="20"/>
         </w:rPr>
-        <w:t xml:space="preserve"/>
-      </w:r>
-    </w:p>
-    <w:p>
-      <w:pPr>
-        <w:spacing w:after="0" w:before="0" w:line="240" w:lineRule="auto"/>
-      </w:pPr>
-      <w:r>
-        <w:rPr>
-          <w:rFonts w:ascii="Consolas" w:cs="Consolas" w:eastAsia="Consolas" w:hAnsi="Consolas"/>
-          <w:sz w:val="20"/>
-          <w:szCs w:val="20"/>
-        </w:rPr>
         <w:t xml:space="preserve">            i += 1</w:t>
       </w:r>
     </w:p>
@@ -5018,19 +3874,6 @@
           <w:sz w:val="20"/>
           <w:szCs w:val="20"/>
         </w:rPr>
-        <w:t xml:space="preserve"/>
-      </w:r>
-    </w:p>
-    <w:p>
-      <w:pPr>
-        <w:spacing w:after="0" w:before="0" w:line="240" w:lineRule="auto"/>
-      </w:pPr>
-      <w:r>
-        <w:rPr>
-          <w:rFonts w:ascii="Consolas" w:cs="Consolas" w:eastAsia="Consolas" w:hAnsi="Consolas"/>
-          <w:sz w:val="20"/>
-          <w:szCs w:val="20"/>
-        </w:rPr>
         <w:t xml:space="preserve">            j += 1</w:t>
       </w:r>
     </w:p>
@@ -5044,19 +3887,6 @@
           <w:sz w:val="20"/>
           <w:szCs w:val="20"/>
         </w:rPr>
-        <w:t xml:space="preserve"/>
-      </w:r>
-    </w:p>
-    <w:p>
-      <w:pPr>
-        <w:spacing w:after="0" w:before="0" w:line="240" w:lineRule="auto"/>
-      </w:pPr>
-      <w:r>
-        <w:rPr>
-          <w:rFonts w:ascii="Consolas" w:cs="Consolas" w:eastAsia="Consolas" w:hAnsi="Consolas"/>
-          <w:sz w:val="20"/>
-          <w:szCs w:val="20"/>
-        </w:rPr>
         <w:t xml:space="preserve">            if j == len(pattern):</w:t>
       </w:r>
     </w:p>
@@ -5070,19 +3900,6 @@
           <w:sz w:val="20"/>
           <w:szCs w:val="20"/>
         </w:rPr>
-        <w:t xml:space="preserve"/>
-      </w:r>
-    </w:p>
-    <w:p>
-      <w:pPr>
-        <w:spacing w:after="0" w:before="0" w:line="240" w:lineRule="auto"/>
-      </w:pPr>
-      <w:r>
-        <w:rPr>
-          <w:rFonts w:ascii="Consolas" w:cs="Consolas" w:eastAsia="Consolas" w:hAnsi="Consolas"/>
-          <w:sz w:val="20"/>
-          <w:szCs w:val="20"/>
-        </w:rPr>
         <w:t xml:space="preserve">                return i - j</w:t>
       </w:r>
     </w:p>
@@ -5096,19 +3913,6 @@
           <w:sz w:val="20"/>
           <w:szCs w:val="20"/>
         </w:rPr>
-        <w:t xml:space="preserve"/>
-      </w:r>
-    </w:p>
-    <w:p>
-      <w:pPr>
-        <w:spacing w:after="0" w:before="0" w:line="240" w:lineRule="auto"/>
-      </w:pPr>
-      <w:r>
-        <w:rPr>
-          <w:rFonts w:ascii="Consolas" w:cs="Consolas" w:eastAsia="Consolas" w:hAnsi="Consolas"/>
-          <w:sz w:val="20"/>
-          <w:szCs w:val="20"/>
-        </w:rPr>
         <w:t xml:space="preserve">        else:</w:t>
       </w:r>
     </w:p>
@@ -5122,19 +3926,6 @@
           <w:sz w:val="20"/>
           <w:szCs w:val="20"/>
         </w:rPr>
-        <w:t xml:space="preserve"/>
-      </w:r>
-    </w:p>
-    <w:p>
-      <w:pPr>
-        <w:spacing w:after="0" w:before="0" w:line="240" w:lineRule="auto"/>
-      </w:pPr>
-      <w:r>
-        <w:rPr>
-          <w:rFonts w:ascii="Consolas" w:cs="Consolas" w:eastAsia="Consolas" w:hAnsi="Consolas"/>
-          <w:sz w:val="20"/>
-          <w:szCs w:val="20"/>
-        </w:rPr>
         <w:t xml:space="preserve">            if j &gt; 0:</w:t>
       </w:r>
     </w:p>
@@ -5148,19 +3939,6 @@
           <w:sz w:val="20"/>
           <w:szCs w:val="20"/>
         </w:rPr>
-        <w:t xml:space="preserve"/>
-      </w:r>
-    </w:p>
-    <w:p>
-      <w:pPr>
-        <w:spacing w:after="0" w:before="0" w:line="240" w:lineRule="auto"/>
-      </w:pPr>
-      <w:r>
-        <w:rPr>
-          <w:rFonts w:ascii="Consolas" w:cs="Consolas" w:eastAsia="Consolas" w:hAnsi="Consolas"/>
-          <w:sz w:val="20"/>
-          <w:szCs w:val="20"/>
-        </w:rPr>
         <w:t xml:space="preserve">                j = lps[j - 1]</w:t>
       </w:r>
     </w:p>
@@ -5174,19 +3952,6 @@
           <w:sz w:val="20"/>
           <w:szCs w:val="20"/>
         </w:rPr>
-        <w:t xml:space="preserve"/>
-      </w:r>
-    </w:p>
-    <w:p>
-      <w:pPr>
-        <w:spacing w:after="0" w:before="0" w:line="240" w:lineRule="auto"/>
-      </w:pPr>
-      <w:r>
-        <w:rPr>
-          <w:rFonts w:ascii="Consolas" w:cs="Consolas" w:eastAsia="Consolas" w:hAnsi="Consolas"/>
-          <w:sz w:val="20"/>
-          <w:szCs w:val="20"/>
-        </w:rPr>
         <w:t xml:space="preserve">            else:</w:t>
       </w:r>
     </w:p>
@@ -5200,19 +3965,6 @@
           <w:sz w:val="20"/>
           <w:szCs w:val="20"/>
         </w:rPr>
-        <w:t xml:space="preserve"/>
-      </w:r>
-    </w:p>
-    <w:p>
-      <w:pPr>
-        <w:spacing w:after="0" w:before="0" w:line="240" w:lineRule="auto"/>
-      </w:pPr>
-      <w:r>
-        <w:rPr>
-          <w:rFonts w:ascii="Consolas" w:cs="Consolas" w:eastAsia="Consolas" w:hAnsi="Consolas"/>
-          <w:sz w:val="20"/>
-          <w:szCs w:val="20"/>
-        </w:rPr>
         <w:t xml:space="preserve">                i += 1</w:t>
       </w:r>
     </w:p>
@@ -5226,19 +3978,6 @@
           <w:sz w:val="20"/>
           <w:szCs w:val="20"/>
         </w:rPr>
-        <w:t xml:space="preserve"/>
-      </w:r>
-    </w:p>
-    <w:p>
-      <w:pPr>
-        <w:spacing w:after="0" w:before="0" w:line="240" w:lineRule="auto"/>
-      </w:pPr>
-      <w:r>
-        <w:rPr>
-          <w:rFonts w:ascii="Consolas" w:cs="Consolas" w:eastAsia="Consolas" w:hAnsi="Consolas"/>
-          <w:sz w:val="20"/>
-          <w:szCs w:val="20"/>
-        </w:rPr>
         <w:t xml:space="preserve">    return -1</w:t>
       </w:r>
     </w:p>
@@ -5252,19 +3991,6 @@
           <w:sz w:val="20"/>
           <w:szCs w:val="20"/>
         </w:rPr>
-        <w:t xml:space="preserve"/>
-      </w:r>
-    </w:p>
-    <w:p>
-      <w:pPr>
-        <w:spacing w:after="0" w:before="0" w:line="240" w:lineRule="auto"/>
-      </w:pPr>
-      <w:r>
-        <w:rPr>
-          <w:rFonts w:ascii="Consolas" w:cs="Consolas" w:eastAsia="Consolas" w:hAnsi="Consolas"/>
-          <w:sz w:val="20"/>
-          <w:szCs w:val="20"/>
-        </w:rPr>
         <w:t xml:space="preserve">text = "ABABDABACDABABCABAB"</w:t>
       </w:r>
     </w:p>
@@ -5278,19 +4004,6 @@
           <w:sz w:val="20"/>
           <w:szCs w:val="20"/>
         </w:rPr>
-        <w:t xml:space="preserve"/>
-      </w:r>
-    </w:p>
-    <w:p>
-      <w:pPr>
-        <w:spacing w:after="0" w:before="0" w:line="240" w:lineRule="auto"/>
-      </w:pPr>
-      <w:r>
-        <w:rPr>
-          <w:rFonts w:ascii="Consolas" w:cs="Consolas" w:eastAsia="Consolas" w:hAnsi="Consolas"/>
-          <w:sz w:val="20"/>
-          <w:szCs w:val="20"/>
-        </w:rPr>
         <w:t xml:space="preserve">pattern = "ABABCABB"</w:t>
       </w:r>
     </w:p>
@@ -5304,33 +4017,7 @@
           <w:sz w:val="20"/>
           <w:szCs w:val="20"/>
         </w:rPr>
-        <w:t xml:space="preserve"/>
-      </w:r>
-    </w:p>
-    <w:p>
-      <w:pPr>
-        <w:spacing w:after="0" w:before="0" w:line="240" w:lineRule="auto"/>
-      </w:pPr>
-      <w:r>
-        <w:rPr>
-          <w:rFonts w:ascii="Consolas" w:cs="Consolas" w:eastAsia="Consolas" w:hAnsi="Consolas"/>
-          <w:sz w:val="20"/>
-          <w:szCs w:val="20"/>
-        </w:rPr>
-        <w:t xml:space="preserve">print("Pattern found at index:",</w:t>
-      </w:r>
-    </w:p>
-    <w:p>
-      <w:pPr>
-        <w:spacing w:after="0" w:before="0" w:line="240" w:lineRule="auto"/>
-      </w:pPr>
-      <w:r>
-        <w:rPr>
-          <w:rFonts w:ascii="Consolas" w:cs="Consolas" w:eastAsia="Consolas" w:hAnsi="Consolas"/>
-          <w:sz w:val="20"/>
-          <w:szCs w:val="20"/>
-        </w:rPr>
-        <w:t xml:space="preserve">      kmp_search(text, pattern))</w:t>
+        <w:t xml:space="preserve">print("Pattern found at index:", kmp_search(text, pattern))</w:t>
       </w:r>
     </w:p>
     <w:p>
@@ -5591,19 +4278,6 @@
           <w:sz w:val="20"/>
           <w:szCs w:val="20"/>
         </w:rPr>
-        <w:t xml:space="preserve"/>
-      </w:r>
-    </w:p>
-    <w:p>
-      <w:pPr>
-        <w:spacing w:after="0" w:before="0" w:line="240" w:lineRule="auto"/>
-      </w:pPr>
-      <w:r>
-        <w:rPr>
-          <w:rFonts w:ascii="Consolas" w:cs="Consolas" w:eastAsia="Consolas" w:hAnsi="Consolas"/>
-          <w:sz w:val="20"/>
-          <w:szCs w:val="20"/>
-        </w:rPr>
         <w:t xml:space="preserve">    largest = i</w:t>
       </w:r>
     </w:p>
@@ -5617,19 +4291,6 @@
           <w:sz w:val="20"/>
           <w:szCs w:val="20"/>
         </w:rPr>
-        <w:t xml:space="preserve"/>
-      </w:r>
-    </w:p>
-    <w:p>
-      <w:pPr>
-        <w:spacing w:after="0" w:before="0" w:line="240" w:lineRule="auto"/>
-      </w:pPr>
-      <w:r>
-        <w:rPr>
-          <w:rFonts w:ascii="Consolas" w:cs="Consolas" w:eastAsia="Consolas" w:hAnsi="Consolas"/>
-          <w:sz w:val="20"/>
-          <w:szCs w:val="20"/>
-        </w:rPr>
         <w:t xml:space="preserve">    left = 2 * i + 1</w:t>
       </w:r>
     </w:p>
@@ -5643,19 +4304,6 @@
           <w:sz w:val="20"/>
           <w:szCs w:val="20"/>
         </w:rPr>
-        <w:t xml:space="preserve"/>
-      </w:r>
-    </w:p>
-    <w:p>
-      <w:pPr>
-        <w:spacing w:after="0" w:before="0" w:line="240" w:lineRule="auto"/>
-      </w:pPr>
-      <w:r>
-        <w:rPr>
-          <w:rFonts w:ascii="Consolas" w:cs="Consolas" w:eastAsia="Consolas" w:hAnsi="Consolas"/>
-          <w:sz w:val="20"/>
-          <w:szCs w:val="20"/>
-        </w:rPr>
         <w:t xml:space="preserve">    right = 2 * i + 2</w:t>
       </w:r>
     </w:p>
@@ -5669,19 +4317,6 @@
           <w:sz w:val="20"/>
           <w:szCs w:val="20"/>
         </w:rPr>
-        <w:t xml:space="preserve"/>
-      </w:r>
-    </w:p>
-    <w:p>
-      <w:pPr>
-        <w:spacing w:after="0" w:before="0" w:line="240" w:lineRule="auto"/>
-      </w:pPr>
-      <w:r>
-        <w:rPr>
-          <w:rFonts w:ascii="Consolas" w:cs="Consolas" w:eastAsia="Consolas" w:hAnsi="Consolas"/>
-          <w:sz w:val="20"/>
-          <w:szCs w:val="20"/>
-        </w:rPr>
         <w:t xml:space="preserve">    if left &lt; n and arr[left] &gt; arr[largest]:</w:t>
       </w:r>
     </w:p>
@@ -5695,19 +4330,6 @@
           <w:sz w:val="20"/>
           <w:szCs w:val="20"/>
         </w:rPr>
-        <w:t xml:space="preserve"/>
-      </w:r>
-    </w:p>
-    <w:p>
-      <w:pPr>
-        <w:spacing w:after="0" w:before="0" w:line="240" w:lineRule="auto"/>
-      </w:pPr>
-      <w:r>
-        <w:rPr>
-          <w:rFonts w:ascii="Consolas" w:cs="Consolas" w:eastAsia="Consolas" w:hAnsi="Consolas"/>
-          <w:sz w:val="20"/>
-          <w:szCs w:val="20"/>
-        </w:rPr>
         <w:t xml:space="preserve">        largest = left</w:t>
       </w:r>
     </w:p>
@@ -5721,19 +4343,6 @@
           <w:sz w:val="20"/>
           <w:szCs w:val="20"/>
         </w:rPr>
-        <w:t xml:space="preserve"/>
-      </w:r>
-    </w:p>
-    <w:p>
-      <w:pPr>
-        <w:spacing w:after="0" w:before="0" w:line="240" w:lineRule="auto"/>
-      </w:pPr>
-      <w:r>
-        <w:rPr>
-          <w:rFonts w:ascii="Consolas" w:cs="Consolas" w:eastAsia="Consolas" w:hAnsi="Consolas"/>
-          <w:sz w:val="20"/>
-          <w:szCs w:val="20"/>
-        </w:rPr>
         <w:t xml:space="preserve">    if right &lt; n and arr[right] &gt; arr[largest]:</w:t>
       </w:r>
     </w:p>
@@ -5747,19 +4356,6 @@
           <w:sz w:val="20"/>
           <w:szCs w:val="20"/>
         </w:rPr>
-        <w:t xml:space="preserve"/>
-      </w:r>
-    </w:p>
-    <w:p>
-      <w:pPr>
-        <w:spacing w:after="0" w:before="0" w:line="240" w:lineRule="auto"/>
-      </w:pPr>
-      <w:r>
-        <w:rPr>
-          <w:rFonts w:ascii="Consolas" w:cs="Consolas" w:eastAsia="Consolas" w:hAnsi="Consolas"/>
-          <w:sz w:val="20"/>
-          <w:szCs w:val="20"/>
-        </w:rPr>
         <w:t xml:space="preserve">        largest = right</w:t>
       </w:r>
     </w:p>
@@ -5773,19 +4369,6 @@
           <w:sz w:val="20"/>
           <w:szCs w:val="20"/>
         </w:rPr>
-        <w:t xml:space="preserve"/>
-      </w:r>
-    </w:p>
-    <w:p>
-      <w:pPr>
-        <w:spacing w:after="0" w:before="0" w:line="240" w:lineRule="auto"/>
-      </w:pPr>
-      <w:r>
-        <w:rPr>
-          <w:rFonts w:ascii="Consolas" w:cs="Consolas" w:eastAsia="Consolas" w:hAnsi="Consolas"/>
-          <w:sz w:val="20"/>
-          <w:szCs w:val="20"/>
-        </w:rPr>
         <w:t xml:space="preserve">    if largest != i:</w:t>
       </w:r>
     </w:p>
@@ -5799,19 +4382,6 @@
           <w:sz w:val="20"/>
           <w:szCs w:val="20"/>
         </w:rPr>
-        <w:t xml:space="preserve"/>
-      </w:r>
-    </w:p>
-    <w:p>
-      <w:pPr>
-        <w:spacing w:after="0" w:before="0" w:line="240" w:lineRule="auto"/>
-      </w:pPr>
-      <w:r>
-        <w:rPr>
-          <w:rFonts w:ascii="Consolas" w:cs="Consolas" w:eastAsia="Consolas" w:hAnsi="Consolas"/>
-          <w:sz w:val="20"/>
-          <w:szCs w:val="20"/>
-        </w:rPr>
         <w:t xml:space="preserve">        arr[i], arr[largest] = arr[largest], arr[i]</w:t>
       </w:r>
     </w:p>
@@ -5825,19 +4395,6 @@
           <w:sz w:val="20"/>
           <w:szCs w:val="20"/>
         </w:rPr>
-        <w:t xml:space="preserve"/>
-      </w:r>
-    </w:p>
-    <w:p>
-      <w:pPr>
-        <w:spacing w:after="0" w:before="0" w:line="240" w:lineRule="auto"/>
-      </w:pPr>
-      <w:r>
-        <w:rPr>
-          <w:rFonts w:ascii="Consolas" w:cs="Consolas" w:eastAsia="Consolas" w:hAnsi="Consolas"/>
-          <w:sz w:val="20"/>
-          <w:szCs w:val="20"/>
-        </w:rPr>
         <w:t xml:space="preserve">        heapify(arr, n, largest)</w:t>
       </w:r>
     </w:p>
@@ -5851,19 +4408,6 @@
           <w:sz w:val="20"/>
           <w:szCs w:val="20"/>
         </w:rPr>
-        <w:t xml:space="preserve"/>
-      </w:r>
-    </w:p>
-    <w:p>
-      <w:pPr>
-        <w:spacing w:after="0" w:before="0" w:line="240" w:lineRule="auto"/>
-      </w:pPr>
-      <w:r>
-        <w:rPr>
-          <w:rFonts w:ascii="Consolas" w:cs="Consolas" w:eastAsia="Consolas" w:hAnsi="Consolas"/>
-          <w:sz w:val="20"/>
-          <w:szCs w:val="20"/>
-        </w:rPr>
         <w:t xml:space="preserve">def heap_sort(arr):</w:t>
       </w:r>
     </w:p>
@@ -5877,19 +4421,6 @@
           <w:sz w:val="20"/>
           <w:szCs w:val="20"/>
         </w:rPr>
-        <w:t xml:space="preserve"/>
-      </w:r>
-    </w:p>
-    <w:p>
-      <w:pPr>
-        <w:spacing w:after="0" w:before="0" w:line="240" w:lineRule="auto"/>
-      </w:pPr>
-      <w:r>
-        <w:rPr>
-          <w:rFonts w:ascii="Consolas" w:cs="Consolas" w:eastAsia="Consolas" w:hAnsi="Consolas"/>
-          <w:sz w:val="20"/>
-          <w:szCs w:val="20"/>
-        </w:rPr>
         <w:t xml:space="preserve">    n = len(arr)</w:t>
       </w:r>
     </w:p>
@@ -5903,19 +4434,6 @@
           <w:sz w:val="20"/>
           <w:szCs w:val="20"/>
         </w:rPr>
-        <w:t xml:space="preserve"/>
-      </w:r>
-    </w:p>
-    <w:p>
-      <w:pPr>
-        <w:spacing w:after="0" w:before="0" w:line="240" w:lineRule="auto"/>
-      </w:pPr>
-      <w:r>
-        <w:rPr>
-          <w:rFonts w:ascii="Consolas" w:cs="Consolas" w:eastAsia="Consolas" w:hAnsi="Consolas"/>
-          <w:sz w:val="20"/>
-          <w:szCs w:val="20"/>
-        </w:rPr>
         <w:t xml:space="preserve">    for i in range(n // 2 - 1, -1, -1):</w:t>
       </w:r>
     </w:p>
@@ -5929,19 +4447,6 @@
           <w:sz w:val="20"/>
           <w:szCs w:val="20"/>
         </w:rPr>
-        <w:t xml:space="preserve"/>
-      </w:r>
-    </w:p>
-    <w:p>
-      <w:pPr>
-        <w:spacing w:after="0" w:before="0" w:line="240" w:lineRule="auto"/>
-      </w:pPr>
-      <w:r>
-        <w:rPr>
-          <w:rFonts w:ascii="Consolas" w:cs="Consolas" w:eastAsia="Consolas" w:hAnsi="Consolas"/>
-          <w:sz w:val="20"/>
-          <w:szCs w:val="20"/>
-        </w:rPr>
         <w:t xml:space="preserve">        heapify(arr, n, i)</w:t>
       </w:r>
     </w:p>
@@ -5955,19 +4460,6 @@
           <w:sz w:val="20"/>
           <w:szCs w:val="20"/>
         </w:rPr>
-        <w:t xml:space="preserve"/>
-      </w:r>
-    </w:p>
-    <w:p>
-      <w:pPr>
-        <w:spacing w:after="0" w:before="0" w:line="240" w:lineRule="auto"/>
-      </w:pPr>
-      <w:r>
-        <w:rPr>
-          <w:rFonts w:ascii="Consolas" w:cs="Consolas" w:eastAsia="Consolas" w:hAnsi="Consolas"/>
-          <w:sz w:val="20"/>
-          <w:szCs w:val="20"/>
-        </w:rPr>
         <w:t xml:space="preserve">    for i in range(n - 1, 0, -1):</w:t>
       </w:r>
     </w:p>
@@ -5981,19 +4473,6 @@
           <w:sz w:val="20"/>
           <w:szCs w:val="20"/>
         </w:rPr>
-        <w:t xml:space="preserve"/>
-      </w:r>
-    </w:p>
-    <w:p>
-      <w:pPr>
-        <w:spacing w:after="0" w:before="0" w:line="240" w:lineRule="auto"/>
-      </w:pPr>
-      <w:r>
-        <w:rPr>
-          <w:rFonts w:ascii="Consolas" w:cs="Consolas" w:eastAsia="Consolas" w:hAnsi="Consolas"/>
-          <w:sz w:val="20"/>
-          <w:szCs w:val="20"/>
-        </w:rPr>
         <w:t xml:space="preserve">        arr[i], arr[0] = arr[0], arr[i]</w:t>
       </w:r>
     </w:p>
@@ -6007,19 +4486,6 @@
           <w:sz w:val="20"/>
           <w:szCs w:val="20"/>
         </w:rPr>
-        <w:t xml:space="preserve"/>
-      </w:r>
-    </w:p>
-    <w:p>
-      <w:pPr>
-        <w:spacing w:after="0" w:before="0" w:line="240" w:lineRule="auto"/>
-      </w:pPr>
-      <w:r>
-        <w:rPr>
-          <w:rFonts w:ascii="Consolas" w:cs="Consolas" w:eastAsia="Consolas" w:hAnsi="Consolas"/>
-          <w:sz w:val="20"/>
-          <w:szCs w:val="20"/>
-        </w:rPr>
         <w:t xml:space="preserve">        heapify(arr, i, 0)</w:t>
       </w:r>
     </w:p>
@@ -6033,19 +4499,6 @@
           <w:sz w:val="20"/>
           <w:szCs w:val="20"/>
         </w:rPr>
-        <w:t xml:space="preserve"/>
-      </w:r>
-    </w:p>
-    <w:p>
-      <w:pPr>
-        <w:spacing w:after="0" w:before="0" w:line="240" w:lineRule="auto"/>
-      </w:pPr>
-      <w:r>
-        <w:rPr>
-          <w:rFonts w:ascii="Consolas" w:cs="Consolas" w:eastAsia="Consolas" w:hAnsi="Consolas"/>
-          <w:sz w:val="20"/>
-          <w:szCs w:val="20"/>
-        </w:rPr>
         <w:t xml:space="preserve">arr = [12, 11, 13, 5, 6, 7]</w:t>
       </w:r>
     </w:p>
@@ -6059,19 +4512,6 @@
           <w:sz w:val="20"/>
           <w:szCs w:val="20"/>
         </w:rPr>
-        <w:t xml:space="preserve"/>
-      </w:r>
-    </w:p>
-    <w:p>
-      <w:pPr>
-        <w:spacing w:after="0" w:before="0" w:line="240" w:lineRule="auto"/>
-      </w:pPr>
-      <w:r>
-        <w:rPr>
-          <w:rFonts w:ascii="Consolas" w:cs="Consolas" w:eastAsia="Consolas" w:hAnsi="Consolas"/>
-          <w:sz w:val="20"/>
-          <w:szCs w:val="20"/>
-        </w:rPr>
         <w:t xml:space="preserve">heap_sort(arr)</w:t>
       </w:r>
     </w:p>
@@ -6085,19 +4525,6 @@
           <w:sz w:val="20"/>
           <w:szCs w:val="20"/>
         </w:rPr>
-        <w:t xml:space="preserve"/>
-      </w:r>
-    </w:p>
-    <w:p>
-      <w:pPr>
-        <w:spacing w:after="0" w:before="0" w:line="240" w:lineRule="auto"/>
-      </w:pPr>
-      <w:r>
-        <w:rPr>
-          <w:rFonts w:ascii="Consolas" w:cs="Consolas" w:eastAsia="Consolas" w:hAnsi="Consolas"/>
-          <w:sz w:val="20"/>
-          <w:szCs w:val="20"/>
-        </w:rPr>
         <w:t xml:space="preserve">print("Sorted array:", arr)</w:t>
       </w:r>
     </w:p>
@@ -6359,19 +4786,6 @@
           <w:sz w:val="20"/>
           <w:szCs w:val="20"/>
         </w:rPr>
-        <w:t xml:space="preserve"/>
-      </w:r>
-    </w:p>
-    <w:p>
-      <w:pPr>
-        <w:spacing w:after="0" w:before="0" w:line="240" w:lineRule="auto"/>
-      </w:pPr>
-      <w:r>
-        <w:rPr>
-          <w:rFonts w:ascii="Consolas" w:cs="Consolas" w:eastAsia="Consolas" w:hAnsi="Consolas"/>
-          <w:sz w:val="20"/>
-          <w:szCs w:val="20"/>
-        </w:rPr>
         <w:t xml:space="preserve">def bfs(capacity, flow, source, sink, parent):</w:t>
       </w:r>
     </w:p>
@@ -6385,19 +4799,6 @@
           <w:sz w:val="20"/>
           <w:szCs w:val="20"/>
         </w:rPr>
-        <w:t xml:space="preserve"/>
-      </w:r>
-    </w:p>
-    <w:p>
-      <w:pPr>
-        <w:spacing w:after="0" w:before="0" w:line="240" w:lineRule="auto"/>
-      </w:pPr>
-      <w:r>
-        <w:rPr>
-          <w:rFonts w:ascii="Consolas" w:cs="Consolas" w:eastAsia="Consolas" w:hAnsi="Consolas"/>
-          <w:sz w:val="20"/>
-          <w:szCs w:val="20"/>
-        </w:rPr>
         <w:t xml:space="preserve">    visited = [False] * len(capacity)</w:t>
       </w:r>
     </w:p>
@@ -6450,19 +4851,6 @@
           <w:sz w:val="20"/>
           <w:szCs w:val="20"/>
         </w:rPr>
-        <w:t xml:space="preserve"/>
-      </w:r>
-    </w:p>
-    <w:p>
-      <w:pPr>
-        <w:spacing w:after="0" w:before="0" w:line="240" w:lineRule="auto"/>
-      </w:pPr>
-      <w:r>
-        <w:rPr>
-          <w:rFonts w:ascii="Consolas" w:cs="Consolas" w:eastAsia="Consolas" w:hAnsi="Consolas"/>
-          <w:sz w:val="20"/>
-          <w:szCs w:val="20"/>
-        </w:rPr>
         <w:t xml:space="preserve">    while queue:</w:t>
       </w:r>
     </w:p>
@@ -6476,19 +4864,6 @@
           <w:sz w:val="20"/>
           <w:szCs w:val="20"/>
         </w:rPr>
-        <w:t xml:space="preserve"/>
-      </w:r>
-    </w:p>
-    <w:p>
-      <w:pPr>
-        <w:spacing w:after="0" w:before="0" w:line="240" w:lineRule="auto"/>
-      </w:pPr>
-      <w:r>
-        <w:rPr>
-          <w:rFonts w:ascii="Consolas" w:cs="Consolas" w:eastAsia="Consolas" w:hAnsi="Consolas"/>
-          <w:sz w:val="20"/>
-          <w:szCs w:val="20"/>
-        </w:rPr>
         <w:t xml:space="preserve">        u = queue.popleft()</w:t>
       </w:r>
     </w:p>
@@ -6502,19 +4877,6 @@
           <w:sz w:val="20"/>
           <w:szCs w:val="20"/>
         </w:rPr>
-        <w:t xml:space="preserve"/>
-      </w:r>
-    </w:p>
-    <w:p>
-      <w:pPr>
-        <w:spacing w:after="0" w:before="0" w:line="240" w:lineRule="auto"/>
-      </w:pPr>
-      <w:r>
-        <w:rPr>
-          <w:rFonts w:ascii="Consolas" w:cs="Consolas" w:eastAsia="Consolas" w:hAnsi="Consolas"/>
-          <w:sz w:val="20"/>
-          <w:szCs w:val="20"/>
-        </w:rPr>
         <w:t xml:space="preserve">        for v in range(len(capacity)):</w:t>
       </w:r>
     </w:p>
@@ -6528,19 +4890,6 @@
           <w:sz w:val="20"/>
           <w:szCs w:val="20"/>
         </w:rPr>
-        <w:t xml:space="preserve"/>
-      </w:r>
-    </w:p>
-    <w:p>
-      <w:pPr>
-        <w:spacing w:after="0" w:before="0" w:line="240" w:lineRule="auto"/>
-      </w:pPr>
-      <w:r>
-        <w:rPr>
-          <w:rFonts w:ascii="Consolas" w:cs="Consolas" w:eastAsia="Consolas" w:hAnsi="Consolas"/>
-          <w:sz w:val="20"/>
-          <w:szCs w:val="20"/>
-        </w:rPr>
         <w:t xml:space="preserve">            if (not visited[v] and capacity[u][v] - flow[u][v] &gt; 0):</w:t>
       </w:r>
     </w:p>
@@ -6554,19 +4903,6 @@
           <w:sz w:val="20"/>
           <w:szCs w:val="20"/>
         </w:rPr>
-        <w:t xml:space="preserve"/>
-      </w:r>
-    </w:p>
-    <w:p>
-      <w:pPr>
-        <w:spacing w:after="0" w:before="0" w:line="240" w:lineRule="auto"/>
-      </w:pPr>
-      <w:r>
-        <w:rPr>
-          <w:rFonts w:ascii="Consolas" w:cs="Consolas" w:eastAsia="Consolas" w:hAnsi="Consolas"/>
-          <w:sz w:val="20"/>
-          <w:szCs w:val="20"/>
-        </w:rPr>
         <w:t xml:space="preserve">                queue.append(v)</w:t>
       </w:r>
     </w:p>
@@ -6606,19 +4942,6 @@
           <w:sz w:val="20"/>
           <w:szCs w:val="20"/>
         </w:rPr>
-        <w:t xml:space="preserve"/>
-      </w:r>
-    </w:p>
-    <w:p>
-      <w:pPr>
-        <w:spacing w:after="0" w:before="0" w:line="240" w:lineRule="auto"/>
-      </w:pPr>
-      <w:r>
-        <w:rPr>
-          <w:rFonts w:ascii="Consolas" w:cs="Consolas" w:eastAsia="Consolas" w:hAnsi="Consolas"/>
-          <w:sz w:val="20"/>
-          <w:szCs w:val="20"/>
-        </w:rPr>
         <w:t xml:space="preserve">                if v == sink:</w:t>
       </w:r>
     </w:p>
@@ -6645,19 +4968,6 @@
           <w:sz w:val="20"/>
           <w:szCs w:val="20"/>
         </w:rPr>
-        <w:t xml:space="preserve"/>
-      </w:r>
-    </w:p>
-    <w:p>
-      <w:pPr>
-        <w:spacing w:after="0" w:before="0" w:line="240" w:lineRule="auto"/>
-      </w:pPr>
-      <w:r>
-        <w:rPr>
-          <w:rFonts w:ascii="Consolas" w:cs="Consolas" w:eastAsia="Consolas" w:hAnsi="Consolas"/>
-          <w:sz w:val="20"/>
-          <w:szCs w:val="20"/>
-        </w:rPr>
         <w:t xml:space="preserve">    return False</w:t>
       </w:r>
     </w:p>
@@ -6671,19 +4981,6 @@
           <w:sz w:val="20"/>
           <w:szCs w:val="20"/>
         </w:rPr>
-        <w:t xml:space="preserve"/>
-      </w:r>
-    </w:p>
-    <w:p>
-      <w:pPr>
-        <w:spacing w:after="0" w:before="0" w:line="240" w:lineRule="auto"/>
-      </w:pPr>
-      <w:r>
-        <w:rPr>
-          <w:rFonts w:ascii="Consolas" w:cs="Consolas" w:eastAsia="Consolas" w:hAnsi="Consolas"/>
-          <w:sz w:val="20"/>
-          <w:szCs w:val="20"/>
-        </w:rPr>
         <w:t xml:space="preserve">def ford_fulkerson(capacity, source, sink):</w:t>
       </w:r>
     </w:p>
@@ -6697,19 +4994,6 @@
           <w:sz w:val="20"/>
           <w:szCs w:val="20"/>
         </w:rPr>
-        <w:t xml:space="preserve"/>
-      </w:r>
-    </w:p>
-    <w:p>
-      <w:pPr>
-        <w:spacing w:after="0" w:before="0" w:line="240" w:lineRule="auto"/>
-      </w:pPr>
-      <w:r>
-        <w:rPr>
-          <w:rFonts w:ascii="Consolas" w:cs="Consolas" w:eastAsia="Consolas" w:hAnsi="Consolas"/>
-          <w:sz w:val="20"/>
-          <w:szCs w:val="20"/>
-        </w:rPr>
         <w:t xml:space="preserve">    n = len(capacity)</w:t>
       </w:r>
     </w:p>
@@ -6723,19 +5007,6 @@
           <w:sz w:val="20"/>
           <w:szCs w:val="20"/>
         </w:rPr>
-        <w:t xml:space="preserve"/>
-      </w:r>
-    </w:p>
-    <w:p>
-      <w:pPr>
-        <w:spacing w:after="0" w:before="0" w:line="240" w:lineRule="auto"/>
-      </w:pPr>
-      <w:r>
-        <w:rPr>
-          <w:rFonts w:ascii="Consolas" w:cs="Consolas" w:eastAsia="Consolas" w:hAnsi="Consolas"/>
-          <w:sz w:val="20"/>
-          <w:szCs w:val="20"/>
-        </w:rPr>
         <w:t xml:space="preserve">    flow = [[0] * n for _ in range(n)]</w:t>
       </w:r>
     </w:p>
@@ -6775,19 +5046,6 @@
           <w:sz w:val="20"/>
           <w:szCs w:val="20"/>
         </w:rPr>
-        <w:t xml:space="preserve"/>
-      </w:r>
-    </w:p>
-    <w:p>
-      <w:pPr>
-        <w:spacing w:after="0" w:before="0" w:line="240" w:lineRule="auto"/>
-      </w:pPr>
-      <w:r>
-        <w:rPr>
-          <w:rFonts w:ascii="Consolas" w:cs="Consolas" w:eastAsia="Consolas" w:hAnsi="Consolas"/>
-          <w:sz w:val="20"/>
-          <w:szCs w:val="20"/>
-        </w:rPr>
         <w:t xml:space="preserve">    while bfs(capacity, flow, source, sink, parent):</w:t>
       </w:r>
     </w:p>
@@ -6801,19 +5059,6 @@
           <w:sz w:val="20"/>
           <w:szCs w:val="20"/>
         </w:rPr>
-        <w:t xml:space="preserve"/>
-      </w:r>
-    </w:p>
-    <w:p>
-      <w:pPr>
-        <w:spacing w:after="0" w:before="0" w:line="240" w:lineRule="auto"/>
-      </w:pPr>
-      <w:r>
-        <w:rPr>
-          <w:rFonts w:ascii="Consolas" w:cs="Consolas" w:eastAsia="Consolas" w:hAnsi="Consolas"/>
-          <w:sz w:val="20"/>
-          <w:szCs w:val="20"/>
-        </w:rPr>
         <w:t xml:space="preserve">        path_flow = float('inf')</w:t>
       </w:r>
     </w:p>
@@ -6840,19 +5085,6 @@
           <w:sz w:val="20"/>
           <w:szCs w:val="20"/>
         </w:rPr>
-        <w:t xml:space="preserve"/>
-      </w:r>
-    </w:p>
-    <w:p>
-      <w:pPr>
-        <w:spacing w:after="0" w:before="0" w:line="240" w:lineRule="auto"/>
-      </w:pPr>
-      <w:r>
-        <w:rPr>
-          <w:rFonts w:ascii="Consolas" w:cs="Consolas" w:eastAsia="Consolas" w:hAnsi="Consolas"/>
-          <w:sz w:val="20"/>
-          <w:szCs w:val="20"/>
-        </w:rPr>
         <w:t xml:space="preserve">        while s != source:</w:t>
       </w:r>
     </w:p>
@@ -6866,72 +5098,7 @@
           <w:sz w:val="20"/>
           <w:szCs w:val="20"/>
         </w:rPr>
-        <w:t xml:space="preserve"/>
-      </w:r>
-    </w:p>
-    <w:p>
-      <w:pPr>
-        <w:spacing w:after="0" w:before="0" w:line="240" w:lineRule="auto"/>
-      </w:pPr>
-      <w:r>
-        <w:rPr>
-          <w:rFonts w:ascii="Consolas" w:cs="Consolas" w:eastAsia="Consolas" w:hAnsi="Consolas"/>
-          <w:sz w:val="20"/>
-          <w:szCs w:val="20"/>
-        </w:rPr>
-        <w:t xml:space="preserve">            path_flow = min(</w:t>
-      </w:r>
-    </w:p>
-    <w:p>
-      <w:pPr>
-        <w:spacing w:after="0" w:before="0" w:line="240" w:lineRule="auto"/>
-      </w:pPr>
-      <w:r>
-        <w:rPr>
-          <w:rFonts w:ascii="Consolas" w:cs="Consolas" w:eastAsia="Consolas" w:hAnsi="Consolas"/>
-          <w:sz w:val="20"/>
-          <w:szCs w:val="20"/>
-        </w:rPr>
-        <w:t xml:space="preserve">                path_flow,</w:t>
-      </w:r>
-    </w:p>
-    <w:p>
-      <w:pPr>
-        <w:spacing w:after="0" w:before="0" w:line="240" w:lineRule="auto"/>
-      </w:pPr>
-      <w:r>
-        <w:rPr>
-          <w:rFonts w:ascii="Consolas" w:cs="Consolas" w:eastAsia="Consolas" w:hAnsi="Consolas"/>
-          <w:sz w:val="20"/>
-          <w:szCs w:val="20"/>
-        </w:rPr>
-        <w:t xml:space="preserve">                capacity[parent[s]][s] -</w:t>
-      </w:r>
-    </w:p>
-    <w:p>
-      <w:pPr>
-        <w:spacing w:after="0" w:before="0" w:line="240" w:lineRule="auto"/>
-      </w:pPr>
-      <w:r>
-        <w:rPr>
-          <w:rFonts w:ascii="Consolas" w:cs="Consolas" w:eastAsia="Consolas" w:hAnsi="Consolas"/>
-          <w:sz w:val="20"/>
-          <w:szCs w:val="20"/>
-        </w:rPr>
-        <w:t xml:space="preserve">                flow[parent[s]][s]</w:t>
-      </w:r>
-    </w:p>
-    <w:p>
-      <w:pPr>
-        <w:spacing w:after="0" w:before="0" w:line="240" w:lineRule="auto"/>
-      </w:pPr>
-      <w:r>
-        <w:rPr>
-          <w:rFonts w:ascii="Consolas" w:cs="Consolas" w:eastAsia="Consolas" w:hAnsi="Consolas"/>
-          <w:sz w:val="20"/>
-          <w:szCs w:val="20"/>
-        </w:rPr>
-        <w:t xml:space="preserve">            )</w:t>
+        <w:t xml:space="preserve">            path_flow = min( path_flow, capacity[parent[s]][s] - flow[parent[s]][s] )</w:t>
       </w:r>
     </w:p>
     <w:p>
@@ -6957,19 +5124,6 @@
           <w:sz w:val="20"/>
           <w:szCs w:val="20"/>
         </w:rPr>
-        <w:t xml:space="preserve"/>
-      </w:r>
-    </w:p>
-    <w:p>
-      <w:pPr>
-        <w:spacing w:after="0" w:before="0" w:line="240" w:lineRule="auto"/>
-      </w:pPr>
-      <w:r>
-        <w:rPr>
-          <w:rFonts w:ascii="Consolas" w:cs="Consolas" w:eastAsia="Consolas" w:hAnsi="Consolas"/>
-          <w:sz w:val="20"/>
-          <w:szCs w:val="20"/>
-        </w:rPr>
         <w:t xml:space="preserve">        max_flow += path_flow</w:t>
       </w:r>
     </w:p>
@@ -6983,19 +5137,6 @@
           <w:sz w:val="20"/>
           <w:szCs w:val="20"/>
         </w:rPr>
-        <w:t xml:space="preserve"/>
-      </w:r>
-    </w:p>
-    <w:p>
-      <w:pPr>
-        <w:spacing w:after="0" w:before="0" w:line="240" w:lineRule="auto"/>
-      </w:pPr>
-      <w:r>
-        <w:rPr>
-          <w:rFonts w:ascii="Consolas" w:cs="Consolas" w:eastAsia="Consolas" w:hAnsi="Consolas"/>
-          <w:sz w:val="20"/>
-          <w:szCs w:val="20"/>
-        </w:rPr>
         <w:t xml:space="preserve">        v = sink</w:t>
       </w:r>
     </w:p>
@@ -7074,19 +5215,6 @@
           <w:sz w:val="20"/>
           <w:szCs w:val="20"/>
         </w:rPr>
-        <w:t xml:space="preserve"/>
-      </w:r>
-    </w:p>
-    <w:p>
-      <w:pPr>
-        <w:spacing w:after="0" w:before="0" w:line="240" w:lineRule="auto"/>
-      </w:pPr>
-      <w:r>
-        <w:rPr>
-          <w:rFonts w:ascii="Consolas" w:cs="Consolas" w:eastAsia="Consolas" w:hAnsi="Consolas"/>
-          <w:sz w:val="20"/>
-          <w:szCs w:val="20"/>
-        </w:rPr>
         <w:t xml:space="preserve">    return max_flow</w:t>
       </w:r>
     </w:p>
@@ -7100,19 +5228,6 @@
           <w:sz w:val="20"/>
           <w:szCs w:val="20"/>
         </w:rPr>
-        <w:t xml:space="preserve"/>
-      </w:r>
-    </w:p>
-    <w:p>
-      <w:pPr>
-        <w:spacing w:after="0" w:before="0" w:line="240" w:lineRule="auto"/>
-      </w:pPr>
-      <w:r>
-        <w:rPr>
-          <w:rFonts w:ascii="Consolas" w:cs="Consolas" w:eastAsia="Consolas" w:hAnsi="Consolas"/>
-          <w:sz w:val="20"/>
-          <w:szCs w:val="20"/>
-        </w:rPr>
         <w:t xml:space="preserve">capacity = [</w:t>
       </w:r>
     </w:p>
@@ -7126,19 +5241,6 @@
           <w:sz w:val="20"/>
           <w:szCs w:val="20"/>
         </w:rPr>
-        <w:t xml:space="preserve"/>
-      </w:r>
-    </w:p>
-    <w:p>
-      <w:pPr>
-        <w:spacing w:after="0" w:before="0" w:line="240" w:lineRule="auto"/>
-      </w:pPr>
-      <w:r>
-        <w:rPr>
-          <w:rFonts w:ascii="Consolas" w:cs="Consolas" w:eastAsia="Consolas" w:hAnsi="Consolas"/>
-          <w:sz w:val="20"/>
-          <w:szCs w:val="20"/>
-        </w:rPr>
         <w:t xml:space="preserve">    [0, 16, 13, 0, 0, 0],</w:t>
       </w:r>
     </w:p>
@@ -7217,19 +5319,6 @@
           <w:sz w:val="20"/>
           <w:szCs w:val="20"/>
         </w:rPr>
-        <w:t xml:space="preserve"/>
-      </w:r>
-    </w:p>
-    <w:p>
-      <w:pPr>
-        <w:spacing w:after="0" w:before="0" w:line="240" w:lineRule="auto"/>
-      </w:pPr>
-      <w:r>
-        <w:rPr>
-          <w:rFonts w:ascii="Consolas" w:cs="Consolas" w:eastAsia="Consolas" w:hAnsi="Consolas"/>
-          <w:sz w:val="20"/>
-          <w:szCs w:val="20"/>
-        </w:rPr>
         <w:t xml:space="preserve">]</w:t>
       </w:r>
     </w:p>
@@ -7243,19 +5332,6 @@
           <w:sz w:val="20"/>
           <w:szCs w:val="20"/>
         </w:rPr>
-        <w:t xml:space="preserve"/>
-      </w:r>
-    </w:p>
-    <w:p>
-      <w:pPr>
-        <w:spacing w:after="0" w:before="0" w:line="240" w:lineRule="auto"/>
-      </w:pPr>
-      <w:r>
-        <w:rPr>
-          <w:rFonts w:ascii="Consolas" w:cs="Consolas" w:eastAsia="Consolas" w:hAnsi="Consolas"/>
-          <w:sz w:val="20"/>
-          <w:szCs w:val="20"/>
-        </w:rPr>
         <w:t xml:space="preserve">source = 0</w:t>
       </w:r>
     </w:p>
@@ -7269,19 +5345,6 @@
           <w:sz w:val="20"/>
           <w:szCs w:val="20"/>
         </w:rPr>
-        <w:t xml:space="preserve"/>
-      </w:r>
-    </w:p>
-    <w:p>
-      <w:pPr>
-        <w:spacing w:after="0" w:before="0" w:line="240" w:lineRule="auto"/>
-      </w:pPr>
-      <w:r>
-        <w:rPr>
-          <w:rFonts w:ascii="Consolas" w:cs="Consolas" w:eastAsia="Consolas" w:hAnsi="Consolas"/>
-          <w:sz w:val="20"/>
-          <w:szCs w:val="20"/>
-        </w:rPr>
         <w:t xml:space="preserve">sink = 5</w:t>
       </w:r>
     </w:p>
@@ -7295,33 +5358,7 @@
           <w:sz w:val="20"/>
           <w:szCs w:val="20"/>
         </w:rPr>
-        <w:t xml:space="preserve"/>
-      </w:r>
-    </w:p>
-    <w:p>
-      <w:pPr>
-        <w:spacing w:after="0" w:before="0" w:line="240" w:lineRule="auto"/>
-      </w:pPr>
-      <w:r>
-        <w:rPr>
-          <w:rFonts w:ascii="Consolas" w:cs="Consolas" w:eastAsia="Consolas" w:hAnsi="Consolas"/>
-          <w:sz w:val="20"/>
-          <w:szCs w:val="20"/>
-        </w:rPr>
-        <w:t xml:space="preserve">print("Maximum Flow:",</w:t>
-      </w:r>
-    </w:p>
-    <w:p>
-      <w:pPr>
-        <w:spacing w:after="0" w:before="0" w:line="240" w:lineRule="auto"/>
-      </w:pPr>
-      <w:r>
-        <w:rPr>
-          <w:rFonts w:ascii="Consolas" w:cs="Consolas" w:eastAsia="Consolas" w:hAnsi="Consolas"/>
-          <w:sz w:val="20"/>
-          <w:szCs w:val="20"/>
-        </w:rPr>
-        <w:t xml:space="preserve">      ford_fulkerson(capacity, source, sink))</w:t>
+        <w:t xml:space="preserve">print("Maximum Flow:", ford_fulkerson(capacity, source, sink))</w:t>
       </w:r>
     </w:p>
     <w:p>

</xml_diff>